<commit_message>
4007 update, impor biblioteka LM 393
</commit_message>
<xml_diff>
--- a/Moog_Prodigy_Project/moog_prodigy_project/KiCad_Zamena_boljih_komponenti_final.docx
+++ b/Moog_Prodigy_Project/moog_prodigy_project/KiCad_Zamena_boljih_komponenti_final.docx
@@ -1,6 +1,6 @@
 
 <file path=word/document.xml><?xml version="1.0" encoding="utf-8"?>
-<w:document xmlns:wpc="http://schemas.microsoft.com/office/word/2010/wordprocessingCanvas" xmlns:cx="http://schemas.microsoft.com/office/drawing/2014/chartex" xmlns:cx1="http://schemas.microsoft.com/office/drawing/2015/9/8/chartex" xmlns:cx2="http://schemas.microsoft.com/office/drawing/2015/10/21/chartex" xmlns:cx3="http://schemas.microsoft.com/office/drawing/2016/5/9/chartex" xmlns:cx4="http://schemas.microsoft.com/office/drawing/2016/5/10/chartex" xmlns:cx5="http://schemas.microsoft.com/office/drawing/2016/5/11/chartex" xmlns:cx6="http://schemas.microsoft.com/office/drawing/2016/5/12/chartex" xmlns:cx7="http://schemas.microsoft.com/office/drawing/2016/5/13/chartex" xmlns:cx8="http://schemas.microsoft.com/office/drawing/2016/5/14/chartex" xmlns:mc="http://schemas.openxmlformats.org/markup-compatibility/2006" xmlns:aink="http://schemas.microsoft.com/office/drawing/2016/ink" xmlns:am3d="http://schemas.microsoft.com/office/drawing/2017/model3d" xmlns:o="urn:schemas-microsoft-com:office:office" xmlns:oel="http://schemas.microsoft.com/office/2019/extlst" xmlns:r="http://schemas.openxmlformats.org/officeDocument/2006/relationships" xmlns:m="http://schemas.openxmlformats.org/officeDocument/2006/math" xmlns:v="urn:schemas-microsoft-com:vml" xmlns:wp14="http://schemas.microsoft.com/office/word/2010/wordprocessingDrawing" xmlns:wp="http://schemas.openxmlformats.org/drawingml/2006/wordprocessingDrawing" xmlns:w10="urn:schemas-microsoft-com:office:word" xmlns:w="http://schemas.openxmlformats.org/wordprocessingml/2006/main" xmlns:w14="http://schemas.microsoft.com/office/word/2010/wordml" xmlns:w15="http://schemas.microsoft.com/office/word/2012/wordml" xmlns:w16cex="http://schemas.microsoft.com/office/word/2018/wordml/cex" xmlns:w16cid="http://schemas.microsoft.com/office/word/2016/wordml/cid" xmlns:w16="http://schemas.microsoft.com/office/word/2018/wordml" xmlns:w16du="http://schemas.microsoft.com/office/word/2023/wordml/word16du" xmlns:w16sdtdh="http://schemas.microsoft.com/office/word/2020/wordml/sdtdatahash" xmlns:w16sdtfl="http://schemas.microsoft.com/office/word/2024/wordml/sdtformatlock" xmlns:w16se="http://schemas.microsoft.com/office/word/2015/wordml/symex" xmlns:wpg="http://schemas.microsoft.com/office/word/2010/wordprocessingGroup" xmlns:wpi="http://schemas.microsoft.com/office/word/2010/wordprocessingInk" xmlns:wne="http://schemas.microsoft.com/office/word/2006/wordml" xmlns:wps="http://schemas.microsoft.com/office/word/2010/wordprocessingShape" mc:Ignorable="w14 w15 w16se w16cid w16 w16cex w16sdtdh w16sdtfl w16du wp14">
+<w:document xmlns:wpc="http://schemas.microsoft.com/office/word/2010/wordprocessingCanvas" xmlns:cx="http://schemas.microsoft.com/office/drawing/2014/chartex" xmlns:cx1="http://schemas.microsoft.com/office/drawing/2015/9/8/chartex" xmlns:mc="http://schemas.openxmlformats.org/markup-compatibility/2006" xmlns:o="urn:schemas-microsoft-com:office:office" xmlns:r="http://schemas.openxmlformats.org/officeDocument/2006/relationships" xmlns:m="http://schemas.openxmlformats.org/officeDocument/2006/math" xmlns:v="urn:schemas-microsoft-com:vml" xmlns:wp14="http://schemas.microsoft.com/office/word/2010/wordprocessingDrawing" xmlns:wp="http://schemas.openxmlformats.org/drawingml/2006/wordprocessingDrawing" xmlns:w10="urn:schemas-microsoft-com:office:word" xmlns:w="http://schemas.openxmlformats.org/wordprocessingml/2006/main" xmlns:w14="http://schemas.microsoft.com/office/word/2010/wordml" xmlns:w15="http://schemas.microsoft.com/office/word/2012/wordml" xmlns:w16se="http://schemas.microsoft.com/office/word/2015/wordml/symex" xmlns:wpg="http://schemas.microsoft.com/office/word/2010/wordprocessingGroup" xmlns:wpi="http://schemas.microsoft.com/office/word/2010/wordprocessingInk" xmlns:wne="http://schemas.microsoft.com/office/word/2006/wordml" xmlns:wps="http://schemas.microsoft.com/office/word/2010/wordprocessingShape" mc:Ignorable="w14 w15 w16se wp14">
   <w:body>
     <w:p>
       <w:pPr>
@@ -162,6 +162,7 @@
             <w:pPr>
               <w:pStyle w:val="Heading2"/>
               <w:spacing w:before="0" w:after="0"/>
+              <w:outlineLvl w:val="1"/>
               <w:rPr>
                 <w:rFonts w:ascii="Arial" w:hAnsi="Arial" w:cs="Arial"/>
               </w:rPr>
@@ -756,6 +757,9 @@
     </w:p>
     <w:p>
       <w:r>
+        <w:rPr>
+          <w:noProof/>
+        </w:rPr>
         <w:drawing>
           <wp:inline distT="0" distB="0" distL="0" distR="0" wp14:anchorId="074D3931" wp14:editId="425098B7">
             <wp:extent cx="5943600" cy="2342515"/>
@@ -812,6 +816,9 @@
     </w:p>
     <w:p>
       <w:r>
+        <w:rPr>
+          <w:noProof/>
+        </w:rPr>
         <w:drawing>
           <wp:inline distT="0" distB="0" distL="0" distR="0" wp14:anchorId="1223D07F" wp14:editId="690AC939">
             <wp:extent cx="5909094" cy="2414905"/>
@@ -868,6 +875,9 @@
     </w:p>
     <w:p>
       <w:r>
+        <w:rPr>
+          <w:noProof/>
+        </w:rPr>
         <w:drawing>
           <wp:inline distT="0" distB="0" distL="0" distR="0" wp14:anchorId="7F977ACC" wp14:editId="36DB5594">
             <wp:extent cx="5805577" cy="1843405"/>
@@ -926,6 +936,9 @@
     </w:p>
     <w:p>
       <w:r>
+        <w:rPr>
+          <w:noProof/>
+        </w:rPr>
         <w:drawing>
           <wp:inline distT="0" distB="0" distL="0" distR="0" wp14:anchorId="1CB727FC" wp14:editId="5F0827F0">
             <wp:extent cx="5786703" cy="2337759"/>
@@ -982,6 +995,9 @@
     </w:p>
     <w:p>
       <w:r>
+        <w:rPr>
+          <w:noProof/>
+        </w:rPr>
         <w:drawing>
           <wp:inline distT="0" distB="0" distL="0" distR="0" wp14:anchorId="5C966FCB" wp14:editId="5BD30318">
             <wp:extent cx="5943600" cy="2870835"/>
@@ -1019,6 +1035,13 @@
         </w:drawing>
       </w:r>
     </w:p>
+    <w:p/>
+    <w:p/>
+    <w:p/>
+    <w:p/>
+    <w:p/>
+    <w:p/>
+    <w:p/>
     <w:p>
       <w:pPr>
         <w:pStyle w:val="ListParagraph"/>
@@ -1029,20 +1052,26 @@
       </w:pPr>
       <w:proofErr w:type="spellStart"/>
       <w:r>
+        <w:lastRenderedPageBreak/>
         <w:t>Zamena</w:t>
       </w:r>
       <w:proofErr w:type="spellEnd"/>
       <w:r>
-        <w:t xml:space="preserve"> za LM393 je ML393BIPWR</w:t>
-      </w:r>
+        <w:t xml:space="preserve"> za LM393 je </w:t>
+      </w:r>
+      <w:r>
+        <w:t>LT1011CN8</w:t>
+      </w:r>
+      <w:bookmarkStart w:id="0" w:name="_GoBack"/>
+      <w:bookmarkEnd w:id="0"/>
     </w:p>
     <w:p>
       <w:r>
         <w:drawing>
-          <wp:inline distT="0" distB="0" distL="0" distR="0" wp14:anchorId="6095F32D" wp14:editId="7CB3F518">
-            <wp:extent cx="5915780" cy="1483743"/>
-            <wp:effectExtent l="0" t="0" r="0" b="2540"/>
-            <wp:docPr id="286375949" name="Picture 1" descr="A screenshot of a phone&#10;&#10;AI-generated content may be incorrect."/>
+          <wp:inline distT="0" distB="0" distL="0" distR="0" wp14:anchorId="062E40CE" wp14:editId="76D9BFB2">
+            <wp:extent cx="5943600" cy="4025265"/>
+            <wp:effectExtent l="0" t="0" r="0" b="0"/>
+            <wp:docPr id="1" name="Picture 1"/>
             <wp:cNvGraphicFramePr>
               <a:graphicFrameLocks xmlns:a="http://schemas.openxmlformats.org/drawingml/2006/main" noChangeAspect="1"/>
             </wp:cNvGraphicFramePr>
@@ -1050,7 +1079,7 @@
               <a:graphicData uri="http://schemas.openxmlformats.org/drawingml/2006/picture">
                 <pic:pic xmlns:pic="http://schemas.openxmlformats.org/drawingml/2006/picture">
                   <pic:nvPicPr>
-                    <pic:cNvPr id="286375949" name="Picture 1" descr="A screenshot of a phone&#10;&#10;AI-generated content may be incorrect."/>
+                    <pic:cNvPr id="1" name=""/>
                     <pic:cNvPicPr/>
                   </pic:nvPicPr>
                   <pic:blipFill>
@@ -1062,7 +1091,7 @@
                   <pic:spPr>
                     <a:xfrm>
                       <a:off x="0" y="0"/>
-                      <a:ext cx="5929878" cy="1487279"/>
+                      <a:ext cx="5943600" cy="4025265"/>
                     </a:xfrm>
                     <a:prstGeom prst="rect">
                       <a:avLst/>
@@ -1089,7 +1118,7 @@
 </file>
 
 <file path=word/endnotes.xml><?xml version="1.0" encoding="utf-8"?>
-<w:endnotes xmlns:wpc="http://schemas.microsoft.com/office/word/2010/wordprocessingCanvas" xmlns:cx="http://schemas.microsoft.com/office/drawing/2014/chartex" xmlns:cx1="http://schemas.microsoft.com/office/drawing/2015/9/8/chartex" xmlns:cx2="http://schemas.microsoft.com/office/drawing/2015/10/21/chartex" xmlns:cx3="http://schemas.microsoft.com/office/drawing/2016/5/9/chartex" xmlns:cx4="http://schemas.microsoft.com/office/drawing/2016/5/10/chartex" xmlns:cx5="http://schemas.microsoft.com/office/drawing/2016/5/11/chartex" xmlns:cx6="http://schemas.microsoft.com/office/drawing/2016/5/12/chartex" xmlns:cx7="http://schemas.microsoft.com/office/drawing/2016/5/13/chartex" xmlns:cx8="http://schemas.microsoft.com/office/drawing/2016/5/14/chartex" xmlns:mc="http://schemas.openxmlformats.org/markup-compatibility/2006" xmlns:aink="http://schemas.microsoft.com/office/drawing/2016/ink" xmlns:am3d="http://schemas.microsoft.com/office/drawing/2017/model3d" xmlns:o="urn:schemas-microsoft-com:office:office" xmlns:oel="http://schemas.microsoft.com/office/2019/extlst" xmlns:r="http://schemas.openxmlformats.org/officeDocument/2006/relationships" xmlns:m="http://schemas.openxmlformats.org/officeDocument/2006/math" xmlns:v="urn:schemas-microsoft-com:vml" xmlns:wp14="http://schemas.microsoft.com/office/word/2010/wordprocessingDrawing" xmlns:wp="http://schemas.openxmlformats.org/drawingml/2006/wordprocessingDrawing" xmlns:w10="urn:schemas-microsoft-com:office:word" xmlns:w="http://schemas.openxmlformats.org/wordprocessingml/2006/main" xmlns:w14="http://schemas.microsoft.com/office/word/2010/wordml" xmlns:w15="http://schemas.microsoft.com/office/word/2012/wordml" xmlns:w16cex="http://schemas.microsoft.com/office/word/2018/wordml/cex" xmlns:w16cid="http://schemas.microsoft.com/office/word/2016/wordml/cid" xmlns:w16="http://schemas.microsoft.com/office/word/2018/wordml" xmlns:w16du="http://schemas.microsoft.com/office/word/2023/wordml/word16du" xmlns:w16sdtdh="http://schemas.microsoft.com/office/word/2020/wordml/sdtdatahash" xmlns:w16sdtfl="http://schemas.microsoft.com/office/word/2024/wordml/sdtformatlock" xmlns:w16se="http://schemas.microsoft.com/office/word/2015/wordml/symex" xmlns:wpg="http://schemas.microsoft.com/office/word/2010/wordprocessingGroup" xmlns:wpi="http://schemas.microsoft.com/office/word/2010/wordprocessingInk" xmlns:wne="http://schemas.microsoft.com/office/word/2006/wordml" xmlns:wps="http://schemas.microsoft.com/office/word/2010/wordprocessingShape" mc:Ignorable="w14 w15 w16se w16cid w16 w16cex w16sdtdh w16sdtfl w16du wp14">
+<w:endnotes xmlns:wpc="http://schemas.microsoft.com/office/word/2010/wordprocessingCanvas" xmlns:cx="http://schemas.microsoft.com/office/drawing/2014/chartex" xmlns:cx1="http://schemas.microsoft.com/office/drawing/2015/9/8/chartex" xmlns:mc="http://schemas.openxmlformats.org/markup-compatibility/2006" xmlns:o="urn:schemas-microsoft-com:office:office" xmlns:r="http://schemas.openxmlformats.org/officeDocument/2006/relationships" xmlns:m="http://schemas.openxmlformats.org/officeDocument/2006/math" xmlns:v="urn:schemas-microsoft-com:vml" xmlns:wp14="http://schemas.microsoft.com/office/word/2010/wordprocessingDrawing" xmlns:wp="http://schemas.openxmlformats.org/drawingml/2006/wordprocessingDrawing" xmlns:w10="urn:schemas-microsoft-com:office:word" xmlns:w="http://schemas.openxmlformats.org/wordprocessingml/2006/main" xmlns:w14="http://schemas.microsoft.com/office/word/2010/wordml" xmlns:w15="http://schemas.microsoft.com/office/word/2012/wordml" xmlns:w16se="http://schemas.microsoft.com/office/word/2015/wordml/symex" xmlns:wpg="http://schemas.microsoft.com/office/word/2010/wordprocessingGroup" xmlns:wpi="http://schemas.microsoft.com/office/word/2010/wordprocessingInk" xmlns:wne="http://schemas.microsoft.com/office/word/2006/wordml" xmlns:wps="http://schemas.microsoft.com/office/word/2010/wordprocessingShape" mc:Ignorable="w14 w15 w16se wp14">
   <w:endnote w:type="separator" w:id="-1">
     <w:p>
       <w:pPr>
@@ -1114,7 +1143,7 @@
 </file>
 
 <file path=word/footer1.xml><?xml version="1.0" encoding="utf-8"?>
-<w:ftr xmlns:wpc="http://schemas.microsoft.com/office/word/2010/wordprocessingCanvas" xmlns:cx="http://schemas.microsoft.com/office/drawing/2014/chartex" xmlns:cx1="http://schemas.microsoft.com/office/drawing/2015/9/8/chartex" xmlns:cx2="http://schemas.microsoft.com/office/drawing/2015/10/21/chartex" xmlns:cx3="http://schemas.microsoft.com/office/drawing/2016/5/9/chartex" xmlns:cx4="http://schemas.microsoft.com/office/drawing/2016/5/10/chartex" xmlns:cx5="http://schemas.microsoft.com/office/drawing/2016/5/11/chartex" xmlns:cx6="http://schemas.microsoft.com/office/drawing/2016/5/12/chartex" xmlns:cx7="http://schemas.microsoft.com/office/drawing/2016/5/13/chartex" xmlns:cx8="http://schemas.microsoft.com/office/drawing/2016/5/14/chartex" xmlns:mc="http://schemas.openxmlformats.org/markup-compatibility/2006" xmlns:aink="http://schemas.microsoft.com/office/drawing/2016/ink" xmlns:am3d="http://schemas.microsoft.com/office/drawing/2017/model3d" xmlns:o="urn:schemas-microsoft-com:office:office" xmlns:oel="http://schemas.microsoft.com/office/2019/extlst" xmlns:r="http://schemas.openxmlformats.org/officeDocument/2006/relationships" xmlns:m="http://schemas.openxmlformats.org/officeDocument/2006/math" xmlns:v="urn:schemas-microsoft-com:vml" xmlns:wp14="http://schemas.microsoft.com/office/word/2010/wordprocessingDrawing" xmlns:wp="http://schemas.openxmlformats.org/drawingml/2006/wordprocessingDrawing" xmlns:w10="urn:schemas-microsoft-com:office:word" xmlns:w="http://schemas.openxmlformats.org/wordprocessingml/2006/main" xmlns:w14="http://schemas.microsoft.com/office/word/2010/wordml" xmlns:w15="http://schemas.microsoft.com/office/word/2012/wordml" xmlns:w16cex="http://schemas.microsoft.com/office/word/2018/wordml/cex" xmlns:w16cid="http://schemas.microsoft.com/office/word/2016/wordml/cid" xmlns:w16="http://schemas.microsoft.com/office/word/2018/wordml" xmlns:w16du="http://schemas.microsoft.com/office/word/2023/wordml/word16du" xmlns:w16sdtdh="http://schemas.microsoft.com/office/word/2020/wordml/sdtdatahash" xmlns:w16sdtfl="http://schemas.microsoft.com/office/word/2024/wordml/sdtformatlock" xmlns:w16se="http://schemas.microsoft.com/office/word/2015/wordml/symex" xmlns:wpg="http://schemas.microsoft.com/office/word/2010/wordprocessingGroup" xmlns:wpi="http://schemas.microsoft.com/office/word/2010/wordprocessingInk" xmlns:wne="http://schemas.microsoft.com/office/word/2006/wordml" xmlns:wps="http://schemas.microsoft.com/office/word/2010/wordprocessingShape" mc:Ignorable="w14 w15 w16se w16cid w16 w16cex w16sdtdh w16sdtfl w16du wp14">
+<w:ftr xmlns:wpc="http://schemas.microsoft.com/office/word/2010/wordprocessingCanvas" xmlns:cx="http://schemas.microsoft.com/office/drawing/2014/chartex" xmlns:cx1="http://schemas.microsoft.com/office/drawing/2015/9/8/chartex" xmlns:mc="http://schemas.openxmlformats.org/markup-compatibility/2006" xmlns:o="urn:schemas-microsoft-com:office:office" xmlns:r="http://schemas.openxmlformats.org/officeDocument/2006/relationships" xmlns:m="http://schemas.openxmlformats.org/officeDocument/2006/math" xmlns:v="urn:schemas-microsoft-com:vml" xmlns:wp14="http://schemas.microsoft.com/office/word/2010/wordprocessingDrawing" xmlns:wp="http://schemas.openxmlformats.org/drawingml/2006/wordprocessingDrawing" xmlns:w10="urn:schemas-microsoft-com:office:word" xmlns:w="http://schemas.openxmlformats.org/wordprocessingml/2006/main" xmlns:w14="http://schemas.microsoft.com/office/word/2010/wordml" xmlns:w15="http://schemas.microsoft.com/office/word/2012/wordml" xmlns:w16se="http://schemas.microsoft.com/office/word/2015/wordml/symex" xmlns:wpg="http://schemas.microsoft.com/office/word/2010/wordprocessingGroup" xmlns:wpi="http://schemas.microsoft.com/office/word/2010/wordprocessingInk" xmlns:wne="http://schemas.microsoft.com/office/word/2006/wordml" xmlns:wps="http://schemas.microsoft.com/office/word/2010/wordprocessingShape" mc:Ignorable="w14 w15 w16se wp14">
   <w:p>
     <w:pPr>
       <w:pStyle w:val="Footer"/>
@@ -1140,7 +1169,7 @@
               <wp:docPr id="1189448808" name="Text Box 2" descr="Internal">
                 <a:extLst xmlns:a="http://schemas.openxmlformats.org/drawingml/2006/main">
                   <a:ext uri="{5AE41FA2-C0FF-4470-9BD4-5FADCA87CBE2}">
-                    <aclsh:classification xmlns:aclsh="http://schemas.microsoft.com/office/drawing/2020/classificationShape" classificationOutcomeType="ftr"/>
+                    <aclsh:classification xmlns:aclsh="http://schemas.microsoft.com/office/drawing/2020/classificationShape" xmlns:w16sdtfl="http://schemas.microsoft.com/office/word/2024/wordml/sdtformatlock" xmlns:w16sdtdh="http://schemas.microsoft.com/office/word/2020/wordml/sdtdatahash" xmlns:w16du="http://schemas.microsoft.com/office/word/2023/wordml/word16du" xmlns:w16="http://schemas.microsoft.com/office/word/2018/wordml" xmlns:w16cid="http://schemas.microsoft.com/office/word/2016/wordml/cid" xmlns:w16cex="http://schemas.microsoft.com/office/word/2018/wordml/cex" xmlns:w="http://schemas.openxmlformats.org/wordprocessingml/2006/main" xmlns:w10="urn:schemas-microsoft-com:office:word" xmlns:v="urn:schemas-microsoft-com:vml" xmlns:oel="http://schemas.microsoft.com/office/2019/extlst" xmlns:o="urn:schemas-microsoft-com:office:office" xmlns:am3d="http://schemas.microsoft.com/office/drawing/2017/model3d" xmlns:aink="http://schemas.microsoft.com/office/drawing/2016/ink" xmlns:cx8="http://schemas.microsoft.com/office/drawing/2016/5/14/chartex" xmlns:cx7="http://schemas.microsoft.com/office/drawing/2016/5/13/chartex" xmlns:cx6="http://schemas.microsoft.com/office/drawing/2016/5/12/chartex" xmlns:cx5="http://schemas.microsoft.com/office/drawing/2016/5/11/chartex" xmlns:cx4="http://schemas.microsoft.com/office/drawing/2016/5/10/chartex" xmlns:cx3="http://schemas.microsoft.com/office/drawing/2016/5/9/chartex" xmlns:cx2="http://schemas.microsoft.com/office/drawing/2015/10/21/chartex" xmlns="" classificationOutcomeType="ftr"/>
                   </a:ext>
                 </a:extLst>
               </wp:docPr>
@@ -1200,7 +1229,7 @@
             </wp:anchor>
           </w:drawing>
         </mc:Choice>
-        <mc:Fallback>
+        <mc:Fallback xmlns:w16sdtfl="http://schemas.microsoft.com/office/word/2024/wordml/sdtformatlock" xmlns:w16sdtdh="http://schemas.microsoft.com/office/word/2020/wordml/sdtdatahash" xmlns:w16du="http://schemas.microsoft.com/office/word/2023/wordml/word16du" xmlns:w16="http://schemas.microsoft.com/office/word/2018/wordml" xmlns:w16cid="http://schemas.microsoft.com/office/word/2016/wordml/cid" xmlns:w16cex="http://schemas.microsoft.com/office/word/2018/wordml/cex" xmlns:oel="http://schemas.microsoft.com/office/2019/extlst" xmlns:am3d="http://schemas.microsoft.com/office/drawing/2017/model3d" xmlns:aink="http://schemas.microsoft.com/office/drawing/2016/ink" xmlns:cx8="http://schemas.microsoft.com/office/drawing/2016/5/14/chartex" xmlns:cx7="http://schemas.microsoft.com/office/drawing/2016/5/13/chartex" xmlns:cx6="http://schemas.microsoft.com/office/drawing/2016/5/12/chartex" xmlns:cx5="http://schemas.microsoft.com/office/drawing/2016/5/11/chartex" xmlns:cx4="http://schemas.microsoft.com/office/drawing/2016/5/10/chartex" xmlns:cx3="http://schemas.microsoft.com/office/drawing/2016/5/9/chartex" xmlns:cx2="http://schemas.microsoft.com/office/drawing/2015/10/21/chartex">
           <w:pict>
             <v:shapetype w14:anchorId="323963D6" id="_x0000_t202" coordsize="21600,21600" o:spt="202" path="m,l,21600r21600,l21600,xe">
               <v:stroke joinstyle="miter"/>
@@ -1245,7 +1274,7 @@
 </file>
 
 <file path=word/footer2.xml><?xml version="1.0" encoding="utf-8"?>
-<w:ftr xmlns:wpc="http://schemas.microsoft.com/office/word/2010/wordprocessingCanvas" xmlns:cx="http://schemas.microsoft.com/office/drawing/2014/chartex" xmlns:cx1="http://schemas.microsoft.com/office/drawing/2015/9/8/chartex" xmlns:cx2="http://schemas.microsoft.com/office/drawing/2015/10/21/chartex" xmlns:cx3="http://schemas.microsoft.com/office/drawing/2016/5/9/chartex" xmlns:cx4="http://schemas.microsoft.com/office/drawing/2016/5/10/chartex" xmlns:cx5="http://schemas.microsoft.com/office/drawing/2016/5/11/chartex" xmlns:cx6="http://schemas.microsoft.com/office/drawing/2016/5/12/chartex" xmlns:cx7="http://schemas.microsoft.com/office/drawing/2016/5/13/chartex" xmlns:cx8="http://schemas.microsoft.com/office/drawing/2016/5/14/chartex" xmlns:mc="http://schemas.openxmlformats.org/markup-compatibility/2006" xmlns:aink="http://schemas.microsoft.com/office/drawing/2016/ink" xmlns:am3d="http://schemas.microsoft.com/office/drawing/2017/model3d" xmlns:o="urn:schemas-microsoft-com:office:office" xmlns:oel="http://schemas.microsoft.com/office/2019/extlst" xmlns:r="http://schemas.openxmlformats.org/officeDocument/2006/relationships" xmlns:m="http://schemas.openxmlformats.org/officeDocument/2006/math" xmlns:v="urn:schemas-microsoft-com:vml" xmlns:wp14="http://schemas.microsoft.com/office/word/2010/wordprocessingDrawing" xmlns:wp="http://schemas.openxmlformats.org/drawingml/2006/wordprocessingDrawing" xmlns:w10="urn:schemas-microsoft-com:office:word" xmlns:w="http://schemas.openxmlformats.org/wordprocessingml/2006/main" xmlns:w14="http://schemas.microsoft.com/office/word/2010/wordml" xmlns:w15="http://schemas.microsoft.com/office/word/2012/wordml" xmlns:w16cex="http://schemas.microsoft.com/office/word/2018/wordml/cex" xmlns:w16cid="http://schemas.microsoft.com/office/word/2016/wordml/cid" xmlns:w16="http://schemas.microsoft.com/office/word/2018/wordml" xmlns:w16du="http://schemas.microsoft.com/office/word/2023/wordml/word16du" xmlns:w16sdtdh="http://schemas.microsoft.com/office/word/2020/wordml/sdtdatahash" xmlns:w16sdtfl="http://schemas.microsoft.com/office/word/2024/wordml/sdtformatlock" xmlns:w16se="http://schemas.microsoft.com/office/word/2015/wordml/symex" xmlns:wpg="http://schemas.microsoft.com/office/word/2010/wordprocessingGroup" xmlns:wpi="http://schemas.microsoft.com/office/word/2010/wordprocessingInk" xmlns:wne="http://schemas.microsoft.com/office/word/2006/wordml" xmlns:wps="http://schemas.microsoft.com/office/word/2010/wordprocessingShape" mc:Ignorable="w14 w15 w16se w16cid w16 w16cex w16sdtdh w16sdtfl w16du wp14">
+<w:ftr xmlns:wpc="http://schemas.microsoft.com/office/word/2010/wordprocessingCanvas" xmlns:cx="http://schemas.microsoft.com/office/drawing/2014/chartex" xmlns:cx1="http://schemas.microsoft.com/office/drawing/2015/9/8/chartex" xmlns:mc="http://schemas.openxmlformats.org/markup-compatibility/2006" xmlns:o="urn:schemas-microsoft-com:office:office" xmlns:r="http://schemas.openxmlformats.org/officeDocument/2006/relationships" xmlns:m="http://schemas.openxmlformats.org/officeDocument/2006/math" xmlns:v="urn:schemas-microsoft-com:vml" xmlns:wp14="http://schemas.microsoft.com/office/word/2010/wordprocessingDrawing" xmlns:wp="http://schemas.openxmlformats.org/drawingml/2006/wordprocessingDrawing" xmlns:w10="urn:schemas-microsoft-com:office:word" xmlns:w="http://schemas.openxmlformats.org/wordprocessingml/2006/main" xmlns:w14="http://schemas.microsoft.com/office/word/2010/wordml" xmlns:w15="http://schemas.microsoft.com/office/word/2012/wordml" xmlns:w16se="http://schemas.microsoft.com/office/word/2015/wordml/symex" xmlns:wpg="http://schemas.microsoft.com/office/word/2010/wordprocessingGroup" xmlns:wpi="http://schemas.microsoft.com/office/word/2010/wordprocessingInk" xmlns:wne="http://schemas.microsoft.com/office/word/2006/wordml" xmlns:wps="http://schemas.microsoft.com/office/word/2010/wordprocessingShape" mc:Ignorable="w14 w15 w16se wp14">
   <w:p>
     <w:pPr>
       <w:pStyle w:val="Footer"/>
@@ -1271,7 +1300,7 @@
               <wp:docPr id="422312151" name="Text Box 3" descr="Internal">
                 <a:extLst xmlns:a="http://schemas.openxmlformats.org/drawingml/2006/main">
                   <a:ext uri="{5AE41FA2-C0FF-4470-9BD4-5FADCA87CBE2}">
-                    <aclsh:classification xmlns:aclsh="http://schemas.microsoft.com/office/drawing/2020/classificationShape" classificationOutcomeType="ftr"/>
+                    <aclsh:classification xmlns:aclsh="http://schemas.microsoft.com/office/drawing/2020/classificationShape" xmlns:w16sdtfl="http://schemas.microsoft.com/office/word/2024/wordml/sdtformatlock" xmlns:w16sdtdh="http://schemas.microsoft.com/office/word/2020/wordml/sdtdatahash" xmlns:w16du="http://schemas.microsoft.com/office/word/2023/wordml/word16du" xmlns:w16="http://schemas.microsoft.com/office/word/2018/wordml" xmlns:w16cid="http://schemas.microsoft.com/office/word/2016/wordml/cid" xmlns:w16cex="http://schemas.microsoft.com/office/word/2018/wordml/cex" xmlns:w="http://schemas.openxmlformats.org/wordprocessingml/2006/main" xmlns:w10="urn:schemas-microsoft-com:office:word" xmlns:v="urn:schemas-microsoft-com:vml" xmlns:oel="http://schemas.microsoft.com/office/2019/extlst" xmlns:o="urn:schemas-microsoft-com:office:office" xmlns:am3d="http://schemas.microsoft.com/office/drawing/2017/model3d" xmlns:aink="http://schemas.microsoft.com/office/drawing/2016/ink" xmlns:cx8="http://schemas.microsoft.com/office/drawing/2016/5/14/chartex" xmlns:cx7="http://schemas.microsoft.com/office/drawing/2016/5/13/chartex" xmlns:cx6="http://schemas.microsoft.com/office/drawing/2016/5/12/chartex" xmlns:cx5="http://schemas.microsoft.com/office/drawing/2016/5/11/chartex" xmlns:cx4="http://schemas.microsoft.com/office/drawing/2016/5/10/chartex" xmlns:cx3="http://schemas.microsoft.com/office/drawing/2016/5/9/chartex" xmlns:cx2="http://schemas.microsoft.com/office/drawing/2015/10/21/chartex" xmlns="" classificationOutcomeType="ftr"/>
                   </a:ext>
                 </a:extLst>
               </wp:docPr>
@@ -1331,7 +1360,7 @@
             </wp:anchor>
           </w:drawing>
         </mc:Choice>
-        <mc:Fallback>
+        <mc:Fallback xmlns:w16sdtfl="http://schemas.microsoft.com/office/word/2024/wordml/sdtformatlock" xmlns:w16sdtdh="http://schemas.microsoft.com/office/word/2020/wordml/sdtdatahash" xmlns:w16du="http://schemas.microsoft.com/office/word/2023/wordml/word16du" xmlns:w16="http://schemas.microsoft.com/office/word/2018/wordml" xmlns:w16cid="http://schemas.microsoft.com/office/word/2016/wordml/cid" xmlns:w16cex="http://schemas.microsoft.com/office/word/2018/wordml/cex" xmlns:oel="http://schemas.microsoft.com/office/2019/extlst" xmlns:am3d="http://schemas.microsoft.com/office/drawing/2017/model3d" xmlns:aink="http://schemas.microsoft.com/office/drawing/2016/ink" xmlns:cx8="http://schemas.microsoft.com/office/drawing/2016/5/14/chartex" xmlns:cx7="http://schemas.microsoft.com/office/drawing/2016/5/13/chartex" xmlns:cx6="http://schemas.microsoft.com/office/drawing/2016/5/12/chartex" xmlns:cx5="http://schemas.microsoft.com/office/drawing/2016/5/11/chartex" xmlns:cx4="http://schemas.microsoft.com/office/drawing/2016/5/10/chartex" xmlns:cx3="http://schemas.microsoft.com/office/drawing/2016/5/9/chartex" xmlns:cx2="http://schemas.microsoft.com/office/drawing/2015/10/21/chartex">
           <w:pict>
             <v:shapetype w14:anchorId="0CC2A22C" id="_x0000_t202" coordsize="21600,21600" o:spt="202" path="m,l,21600r21600,l21600,xe">
               <v:stroke joinstyle="miter"/>
@@ -1376,7 +1405,7 @@
 </file>
 
 <file path=word/footer3.xml><?xml version="1.0" encoding="utf-8"?>
-<w:ftr xmlns:wpc="http://schemas.microsoft.com/office/word/2010/wordprocessingCanvas" xmlns:cx="http://schemas.microsoft.com/office/drawing/2014/chartex" xmlns:cx1="http://schemas.microsoft.com/office/drawing/2015/9/8/chartex" xmlns:cx2="http://schemas.microsoft.com/office/drawing/2015/10/21/chartex" xmlns:cx3="http://schemas.microsoft.com/office/drawing/2016/5/9/chartex" xmlns:cx4="http://schemas.microsoft.com/office/drawing/2016/5/10/chartex" xmlns:cx5="http://schemas.microsoft.com/office/drawing/2016/5/11/chartex" xmlns:cx6="http://schemas.microsoft.com/office/drawing/2016/5/12/chartex" xmlns:cx7="http://schemas.microsoft.com/office/drawing/2016/5/13/chartex" xmlns:cx8="http://schemas.microsoft.com/office/drawing/2016/5/14/chartex" xmlns:mc="http://schemas.openxmlformats.org/markup-compatibility/2006" xmlns:aink="http://schemas.microsoft.com/office/drawing/2016/ink" xmlns:am3d="http://schemas.microsoft.com/office/drawing/2017/model3d" xmlns:o="urn:schemas-microsoft-com:office:office" xmlns:oel="http://schemas.microsoft.com/office/2019/extlst" xmlns:r="http://schemas.openxmlformats.org/officeDocument/2006/relationships" xmlns:m="http://schemas.openxmlformats.org/officeDocument/2006/math" xmlns:v="urn:schemas-microsoft-com:vml" xmlns:wp14="http://schemas.microsoft.com/office/word/2010/wordprocessingDrawing" xmlns:wp="http://schemas.openxmlformats.org/drawingml/2006/wordprocessingDrawing" xmlns:w10="urn:schemas-microsoft-com:office:word" xmlns:w="http://schemas.openxmlformats.org/wordprocessingml/2006/main" xmlns:w14="http://schemas.microsoft.com/office/word/2010/wordml" xmlns:w15="http://schemas.microsoft.com/office/word/2012/wordml" xmlns:w16cex="http://schemas.microsoft.com/office/word/2018/wordml/cex" xmlns:w16cid="http://schemas.microsoft.com/office/word/2016/wordml/cid" xmlns:w16="http://schemas.microsoft.com/office/word/2018/wordml" xmlns:w16du="http://schemas.microsoft.com/office/word/2023/wordml/word16du" xmlns:w16sdtdh="http://schemas.microsoft.com/office/word/2020/wordml/sdtdatahash" xmlns:w16sdtfl="http://schemas.microsoft.com/office/word/2024/wordml/sdtformatlock" xmlns:w16se="http://schemas.microsoft.com/office/word/2015/wordml/symex" xmlns:wpg="http://schemas.microsoft.com/office/word/2010/wordprocessingGroup" xmlns:wpi="http://schemas.microsoft.com/office/word/2010/wordprocessingInk" xmlns:wne="http://schemas.microsoft.com/office/word/2006/wordml" xmlns:wps="http://schemas.microsoft.com/office/word/2010/wordprocessingShape" mc:Ignorable="w14 w15 w16se w16cid w16 w16cex w16sdtdh w16sdtfl w16du wp14">
+<w:ftr xmlns:wpc="http://schemas.microsoft.com/office/word/2010/wordprocessingCanvas" xmlns:cx="http://schemas.microsoft.com/office/drawing/2014/chartex" xmlns:cx1="http://schemas.microsoft.com/office/drawing/2015/9/8/chartex" xmlns:mc="http://schemas.openxmlformats.org/markup-compatibility/2006" xmlns:o="urn:schemas-microsoft-com:office:office" xmlns:r="http://schemas.openxmlformats.org/officeDocument/2006/relationships" xmlns:m="http://schemas.openxmlformats.org/officeDocument/2006/math" xmlns:v="urn:schemas-microsoft-com:vml" xmlns:wp14="http://schemas.microsoft.com/office/word/2010/wordprocessingDrawing" xmlns:wp="http://schemas.openxmlformats.org/drawingml/2006/wordprocessingDrawing" xmlns:w10="urn:schemas-microsoft-com:office:word" xmlns:w="http://schemas.openxmlformats.org/wordprocessingml/2006/main" xmlns:w14="http://schemas.microsoft.com/office/word/2010/wordml" xmlns:w15="http://schemas.microsoft.com/office/word/2012/wordml" xmlns:w16se="http://schemas.microsoft.com/office/word/2015/wordml/symex" xmlns:wpg="http://schemas.microsoft.com/office/word/2010/wordprocessingGroup" xmlns:wpi="http://schemas.microsoft.com/office/word/2010/wordprocessingInk" xmlns:wne="http://schemas.microsoft.com/office/word/2006/wordml" xmlns:wps="http://schemas.microsoft.com/office/word/2010/wordprocessingShape" mc:Ignorable="w14 w15 w16se wp14">
   <w:p>
     <w:pPr>
       <w:pStyle w:val="Footer"/>
@@ -1402,7 +1431,7 @@
               <wp:docPr id="1430184674" name="Text Box 1" descr="Internal">
                 <a:extLst xmlns:a="http://schemas.openxmlformats.org/drawingml/2006/main">
                   <a:ext uri="{5AE41FA2-C0FF-4470-9BD4-5FADCA87CBE2}">
-                    <aclsh:classification xmlns:aclsh="http://schemas.microsoft.com/office/drawing/2020/classificationShape" classificationOutcomeType="ftr"/>
+                    <aclsh:classification xmlns:aclsh="http://schemas.microsoft.com/office/drawing/2020/classificationShape" xmlns:w16sdtfl="http://schemas.microsoft.com/office/word/2024/wordml/sdtformatlock" xmlns:w16sdtdh="http://schemas.microsoft.com/office/word/2020/wordml/sdtdatahash" xmlns:w16du="http://schemas.microsoft.com/office/word/2023/wordml/word16du" xmlns:w16="http://schemas.microsoft.com/office/word/2018/wordml" xmlns:w16cid="http://schemas.microsoft.com/office/word/2016/wordml/cid" xmlns:w16cex="http://schemas.microsoft.com/office/word/2018/wordml/cex" xmlns:w="http://schemas.openxmlformats.org/wordprocessingml/2006/main" xmlns:w10="urn:schemas-microsoft-com:office:word" xmlns:v="urn:schemas-microsoft-com:vml" xmlns:oel="http://schemas.microsoft.com/office/2019/extlst" xmlns:o="urn:schemas-microsoft-com:office:office" xmlns:am3d="http://schemas.microsoft.com/office/drawing/2017/model3d" xmlns:aink="http://schemas.microsoft.com/office/drawing/2016/ink" xmlns:cx8="http://schemas.microsoft.com/office/drawing/2016/5/14/chartex" xmlns:cx7="http://schemas.microsoft.com/office/drawing/2016/5/13/chartex" xmlns:cx6="http://schemas.microsoft.com/office/drawing/2016/5/12/chartex" xmlns:cx5="http://schemas.microsoft.com/office/drawing/2016/5/11/chartex" xmlns:cx4="http://schemas.microsoft.com/office/drawing/2016/5/10/chartex" xmlns:cx3="http://schemas.microsoft.com/office/drawing/2016/5/9/chartex" xmlns:cx2="http://schemas.microsoft.com/office/drawing/2015/10/21/chartex" xmlns="" classificationOutcomeType="ftr"/>
                   </a:ext>
                 </a:extLst>
               </wp:docPr>
@@ -1462,7 +1491,7 @@
             </wp:anchor>
           </w:drawing>
         </mc:Choice>
-        <mc:Fallback>
+        <mc:Fallback xmlns:w16sdtfl="http://schemas.microsoft.com/office/word/2024/wordml/sdtformatlock" xmlns:w16sdtdh="http://schemas.microsoft.com/office/word/2020/wordml/sdtdatahash" xmlns:w16du="http://schemas.microsoft.com/office/word/2023/wordml/word16du" xmlns:w16="http://schemas.microsoft.com/office/word/2018/wordml" xmlns:w16cid="http://schemas.microsoft.com/office/word/2016/wordml/cid" xmlns:w16cex="http://schemas.microsoft.com/office/word/2018/wordml/cex" xmlns:oel="http://schemas.microsoft.com/office/2019/extlst" xmlns:am3d="http://schemas.microsoft.com/office/drawing/2017/model3d" xmlns:aink="http://schemas.microsoft.com/office/drawing/2016/ink" xmlns:cx8="http://schemas.microsoft.com/office/drawing/2016/5/14/chartex" xmlns:cx7="http://schemas.microsoft.com/office/drawing/2016/5/13/chartex" xmlns:cx6="http://schemas.microsoft.com/office/drawing/2016/5/12/chartex" xmlns:cx5="http://schemas.microsoft.com/office/drawing/2016/5/11/chartex" xmlns:cx4="http://schemas.microsoft.com/office/drawing/2016/5/10/chartex" xmlns:cx3="http://schemas.microsoft.com/office/drawing/2016/5/9/chartex" xmlns:cx2="http://schemas.microsoft.com/office/drawing/2015/10/21/chartex">
           <w:pict>
             <v:shapetype w14:anchorId="7D55A092" id="_x0000_t202" coordsize="21600,21600" o:spt="202" path="m,l,21600r21600,l21600,xe">
               <v:stroke joinstyle="miter"/>
@@ -1507,7 +1536,7 @@
 </file>
 
 <file path=word/footnotes.xml><?xml version="1.0" encoding="utf-8"?>
-<w:footnotes xmlns:wpc="http://schemas.microsoft.com/office/word/2010/wordprocessingCanvas" xmlns:cx="http://schemas.microsoft.com/office/drawing/2014/chartex" xmlns:cx1="http://schemas.microsoft.com/office/drawing/2015/9/8/chartex" xmlns:cx2="http://schemas.microsoft.com/office/drawing/2015/10/21/chartex" xmlns:cx3="http://schemas.microsoft.com/office/drawing/2016/5/9/chartex" xmlns:cx4="http://schemas.microsoft.com/office/drawing/2016/5/10/chartex" xmlns:cx5="http://schemas.microsoft.com/office/drawing/2016/5/11/chartex" xmlns:cx6="http://schemas.microsoft.com/office/drawing/2016/5/12/chartex" xmlns:cx7="http://schemas.microsoft.com/office/drawing/2016/5/13/chartex" xmlns:cx8="http://schemas.microsoft.com/office/drawing/2016/5/14/chartex" xmlns:mc="http://schemas.openxmlformats.org/markup-compatibility/2006" xmlns:aink="http://schemas.microsoft.com/office/drawing/2016/ink" xmlns:am3d="http://schemas.microsoft.com/office/drawing/2017/model3d" xmlns:o="urn:schemas-microsoft-com:office:office" xmlns:oel="http://schemas.microsoft.com/office/2019/extlst" xmlns:r="http://schemas.openxmlformats.org/officeDocument/2006/relationships" xmlns:m="http://schemas.openxmlformats.org/officeDocument/2006/math" xmlns:v="urn:schemas-microsoft-com:vml" xmlns:wp14="http://schemas.microsoft.com/office/word/2010/wordprocessingDrawing" xmlns:wp="http://schemas.openxmlformats.org/drawingml/2006/wordprocessingDrawing" xmlns:w10="urn:schemas-microsoft-com:office:word" xmlns:w="http://schemas.openxmlformats.org/wordprocessingml/2006/main" xmlns:w14="http://schemas.microsoft.com/office/word/2010/wordml" xmlns:w15="http://schemas.microsoft.com/office/word/2012/wordml" xmlns:w16cex="http://schemas.microsoft.com/office/word/2018/wordml/cex" xmlns:w16cid="http://schemas.microsoft.com/office/word/2016/wordml/cid" xmlns:w16="http://schemas.microsoft.com/office/word/2018/wordml" xmlns:w16du="http://schemas.microsoft.com/office/word/2023/wordml/word16du" xmlns:w16sdtdh="http://schemas.microsoft.com/office/word/2020/wordml/sdtdatahash" xmlns:w16sdtfl="http://schemas.microsoft.com/office/word/2024/wordml/sdtformatlock" xmlns:w16se="http://schemas.microsoft.com/office/word/2015/wordml/symex" xmlns:wpg="http://schemas.microsoft.com/office/word/2010/wordprocessingGroup" xmlns:wpi="http://schemas.microsoft.com/office/word/2010/wordprocessingInk" xmlns:wne="http://schemas.microsoft.com/office/word/2006/wordml" xmlns:wps="http://schemas.microsoft.com/office/word/2010/wordprocessingShape" mc:Ignorable="w14 w15 w16se w16cid w16 w16cex w16sdtdh w16sdtfl w16du wp14">
+<w:footnotes xmlns:wpc="http://schemas.microsoft.com/office/word/2010/wordprocessingCanvas" xmlns:cx="http://schemas.microsoft.com/office/drawing/2014/chartex" xmlns:cx1="http://schemas.microsoft.com/office/drawing/2015/9/8/chartex" xmlns:mc="http://schemas.openxmlformats.org/markup-compatibility/2006" xmlns:o="urn:schemas-microsoft-com:office:office" xmlns:r="http://schemas.openxmlformats.org/officeDocument/2006/relationships" xmlns:m="http://schemas.openxmlformats.org/officeDocument/2006/math" xmlns:v="urn:schemas-microsoft-com:vml" xmlns:wp14="http://schemas.microsoft.com/office/word/2010/wordprocessingDrawing" xmlns:wp="http://schemas.openxmlformats.org/drawingml/2006/wordprocessingDrawing" xmlns:w10="urn:schemas-microsoft-com:office:word" xmlns:w="http://schemas.openxmlformats.org/wordprocessingml/2006/main" xmlns:w14="http://schemas.microsoft.com/office/word/2010/wordml" xmlns:w15="http://schemas.microsoft.com/office/word/2012/wordml" xmlns:w16se="http://schemas.microsoft.com/office/word/2015/wordml/symex" xmlns:wpg="http://schemas.microsoft.com/office/word/2010/wordprocessingGroup" xmlns:wpi="http://schemas.microsoft.com/office/word/2010/wordprocessingInk" xmlns:wne="http://schemas.microsoft.com/office/word/2006/wordml" xmlns:wps="http://schemas.microsoft.com/office/word/2010/wordprocessingShape" mc:Ignorable="w14 w15 w16se wp14">
   <w:footnote w:type="separator" w:id="-1">
     <w:p>
       <w:pPr>
@@ -1532,7 +1561,7 @@
 </file>
 
 <file path=word/numbering.xml><?xml version="1.0" encoding="utf-8"?>
-<w:numbering xmlns:wpc="http://schemas.microsoft.com/office/word/2010/wordprocessingCanvas" xmlns:cx="http://schemas.microsoft.com/office/drawing/2014/chartex" xmlns:cx1="http://schemas.microsoft.com/office/drawing/2015/9/8/chartex" xmlns:cx2="http://schemas.microsoft.com/office/drawing/2015/10/21/chartex" xmlns:cx3="http://schemas.microsoft.com/office/drawing/2016/5/9/chartex" xmlns:cx4="http://schemas.microsoft.com/office/drawing/2016/5/10/chartex" xmlns:cx5="http://schemas.microsoft.com/office/drawing/2016/5/11/chartex" xmlns:cx6="http://schemas.microsoft.com/office/drawing/2016/5/12/chartex" xmlns:cx7="http://schemas.microsoft.com/office/drawing/2016/5/13/chartex" xmlns:cx8="http://schemas.microsoft.com/office/drawing/2016/5/14/chartex" xmlns:mc="http://schemas.openxmlformats.org/markup-compatibility/2006" xmlns:aink="http://schemas.microsoft.com/office/drawing/2016/ink" xmlns:am3d="http://schemas.microsoft.com/office/drawing/2017/model3d" xmlns:o="urn:schemas-microsoft-com:office:office" xmlns:oel="http://schemas.microsoft.com/office/2019/extlst" xmlns:r="http://schemas.openxmlformats.org/officeDocument/2006/relationships" xmlns:m="http://schemas.openxmlformats.org/officeDocument/2006/math" xmlns:v="urn:schemas-microsoft-com:vml" xmlns:wp14="http://schemas.microsoft.com/office/word/2010/wordprocessingDrawing" xmlns:wp="http://schemas.openxmlformats.org/drawingml/2006/wordprocessingDrawing" xmlns:w10="urn:schemas-microsoft-com:office:word" xmlns:w="http://schemas.openxmlformats.org/wordprocessingml/2006/main" xmlns:w14="http://schemas.microsoft.com/office/word/2010/wordml" xmlns:w15="http://schemas.microsoft.com/office/word/2012/wordml" xmlns:w16cex="http://schemas.microsoft.com/office/word/2018/wordml/cex" xmlns:w16cid="http://schemas.microsoft.com/office/word/2016/wordml/cid" xmlns:w16="http://schemas.microsoft.com/office/word/2018/wordml" xmlns:w16du="http://schemas.microsoft.com/office/word/2023/wordml/word16du" xmlns:w16sdtdh="http://schemas.microsoft.com/office/word/2020/wordml/sdtdatahash" xmlns:w16sdtfl="http://schemas.microsoft.com/office/word/2024/wordml/sdtformatlock" xmlns:w16se="http://schemas.microsoft.com/office/word/2015/wordml/symex" xmlns:wpg="http://schemas.microsoft.com/office/word/2010/wordprocessingGroup" xmlns:wpi="http://schemas.microsoft.com/office/word/2010/wordprocessingInk" xmlns:wne="http://schemas.microsoft.com/office/word/2006/wordml" xmlns:wps="http://schemas.microsoft.com/office/word/2010/wordprocessingShape" mc:Ignorable="w14 w15 w16se w16cid w16 w16cex w16sdtdh w16sdtfl w16du wp14">
+<w:numbering xmlns:wpc="http://schemas.microsoft.com/office/word/2010/wordprocessingCanvas" xmlns:cx="http://schemas.microsoft.com/office/drawing/2014/chartex" xmlns:cx1="http://schemas.microsoft.com/office/drawing/2015/9/8/chartex" xmlns:mc="http://schemas.openxmlformats.org/markup-compatibility/2006" xmlns:o="urn:schemas-microsoft-com:office:office" xmlns:r="http://schemas.openxmlformats.org/officeDocument/2006/relationships" xmlns:m="http://schemas.openxmlformats.org/officeDocument/2006/math" xmlns:v="urn:schemas-microsoft-com:vml" xmlns:wp14="http://schemas.microsoft.com/office/word/2010/wordprocessingDrawing" xmlns:wp="http://schemas.openxmlformats.org/drawingml/2006/wordprocessingDrawing" xmlns:w10="urn:schemas-microsoft-com:office:word" xmlns:w="http://schemas.openxmlformats.org/wordprocessingml/2006/main" xmlns:w14="http://schemas.microsoft.com/office/word/2010/wordml" xmlns:w15="http://schemas.microsoft.com/office/word/2012/wordml" xmlns:w16se="http://schemas.microsoft.com/office/word/2015/wordml/symex" xmlns:wpg="http://schemas.microsoft.com/office/word/2010/wordprocessingGroup" xmlns:wpi="http://schemas.microsoft.com/office/word/2010/wordprocessingInk" xmlns:wne="http://schemas.microsoft.com/office/word/2006/wordml" xmlns:wps="http://schemas.microsoft.com/office/word/2010/wordprocessingShape" mc:Ignorable="w14 w15 w16se wp14">
   <w:abstractNum w:abstractNumId="0" w15:restartNumberingAfterBreak="0">
     <w:nsid w:val="2BC56931"/>
     <w:multiLevelType w:val="hybridMultilevel"/>
@@ -1711,17 +1740,17 @@
       </w:pPr>
     </w:lvl>
   </w:abstractNum>
-  <w:num w:numId="1" w16cid:durableId="918640055">
+  <w:num w:numId="1">
     <w:abstractNumId w:val="1"/>
   </w:num>
-  <w:num w:numId="2" w16cid:durableId="354884902">
+  <w:num w:numId="2">
     <w:abstractNumId w:val="0"/>
   </w:num>
 </w:numbering>
 </file>
 
 <file path=word/styles.xml><?xml version="1.0" encoding="utf-8"?>
-<w:styles xmlns:mc="http://schemas.openxmlformats.org/markup-compatibility/2006" xmlns:r="http://schemas.openxmlformats.org/officeDocument/2006/relationships" xmlns:w="http://schemas.openxmlformats.org/wordprocessingml/2006/main" xmlns:w14="http://schemas.microsoft.com/office/word/2010/wordml" xmlns:w15="http://schemas.microsoft.com/office/word/2012/wordml" xmlns:w16cex="http://schemas.microsoft.com/office/word/2018/wordml/cex" xmlns:w16cid="http://schemas.microsoft.com/office/word/2016/wordml/cid" xmlns:w16="http://schemas.microsoft.com/office/word/2018/wordml" xmlns:w16du="http://schemas.microsoft.com/office/word/2023/wordml/word16du" xmlns:w16sdtdh="http://schemas.microsoft.com/office/word/2020/wordml/sdtdatahash" xmlns:w16sdtfl="http://schemas.microsoft.com/office/word/2024/wordml/sdtformatlock" xmlns:w16se="http://schemas.microsoft.com/office/word/2015/wordml/symex" mc:Ignorable="w14 w15 w16se w16cid w16 w16cex w16sdtdh w16sdtfl w16du">
+<w:styles xmlns:mc="http://schemas.openxmlformats.org/markup-compatibility/2006" xmlns:r="http://schemas.openxmlformats.org/officeDocument/2006/relationships" xmlns:w="http://schemas.openxmlformats.org/wordprocessingml/2006/main" xmlns:w14="http://schemas.microsoft.com/office/word/2010/wordml" xmlns:w15="http://schemas.microsoft.com/office/word/2012/wordml" xmlns:w16se="http://schemas.microsoft.com/office/word/2015/wordml/symex" mc:Ignorable="w14 w15 w16se">
   <w:docDefaults>
     <w:rPrDefault>
       <w:rPr>
@@ -1739,7 +1768,7 @@
       </w:pPr>
     </w:pPrDefault>
   </w:docDefaults>
-  <w:latentStyles w:defLockedState="0" w:defUIPriority="99" w:defSemiHidden="0" w:defUnhideWhenUsed="0" w:defQFormat="0" w:count="376">
+  <w:latentStyles w:defLockedState="0" w:defUIPriority="99" w:defSemiHidden="0" w:defUnhideWhenUsed="0" w:defQFormat="0" w:count="371">
     <w:lsdException w:name="Normal" w:uiPriority="0" w:qFormat="1"/>
     <w:lsdException w:name="heading 1" w:uiPriority="9" w:qFormat="1"/>
     <w:lsdException w:name="heading 2" w:semiHidden="1" w:uiPriority="9" w:unhideWhenUsed="1" w:qFormat="1"/>
@@ -2111,11 +2140,6 @@
     <w:lsdException w:name="List Table 5 Dark Accent 6" w:uiPriority="50"/>
     <w:lsdException w:name="List Table 6 Colorful Accent 6" w:uiPriority="51"/>
     <w:lsdException w:name="List Table 7 Colorful Accent 6" w:uiPriority="52"/>
-    <w:lsdException w:name="Mention" w:semiHidden="1" w:unhideWhenUsed="1"/>
-    <w:lsdException w:name="Smart Hyperlink" w:semiHidden="1" w:unhideWhenUsed="1"/>
-    <w:lsdException w:name="Hashtag" w:semiHidden="1" w:unhideWhenUsed="1"/>
-    <w:lsdException w:name="Unresolved Mention" w:semiHidden="1" w:unhideWhenUsed="1"/>
-    <w:lsdException w:name="Smart Link" w:semiHidden="1" w:unhideWhenUsed="1"/>
   </w:latentStyles>
   <w:style w:type="paragraph" w:default="1" w:styleId="Normal">
     <w:name w:val="Normal"/>

</xml_diff>

<commit_message>
Zamena fet-ova E112 sa BF256C + update dokumentacije
</commit_message>
<xml_diff>
--- a/Moog_Prodigy_Project/moog_prodigy_project/KiCad_Zamena_boljih_komponenti_final.docx
+++ b/Moog_Prodigy_Project/moog_prodigy_project/KiCad_Zamena_boljih_komponenti_final.docx
@@ -1,6 +1,6 @@
 
 <file path=word/document.xml><?xml version="1.0" encoding="utf-8"?>
-<w:document xmlns:wpc="http://schemas.microsoft.com/office/word/2010/wordprocessingCanvas" xmlns:cx="http://schemas.microsoft.com/office/drawing/2014/chartex" xmlns:cx1="http://schemas.microsoft.com/office/drawing/2015/9/8/chartex" xmlns:mc="http://schemas.openxmlformats.org/markup-compatibility/2006" xmlns:o="urn:schemas-microsoft-com:office:office" xmlns:r="http://schemas.openxmlformats.org/officeDocument/2006/relationships" xmlns:m="http://schemas.openxmlformats.org/officeDocument/2006/math" xmlns:v="urn:schemas-microsoft-com:vml" xmlns:wp14="http://schemas.microsoft.com/office/word/2010/wordprocessingDrawing" xmlns:wp="http://schemas.openxmlformats.org/drawingml/2006/wordprocessingDrawing" xmlns:w10="urn:schemas-microsoft-com:office:word" xmlns:w="http://schemas.openxmlformats.org/wordprocessingml/2006/main" xmlns:w14="http://schemas.microsoft.com/office/word/2010/wordml" xmlns:w15="http://schemas.microsoft.com/office/word/2012/wordml" xmlns:w16se="http://schemas.microsoft.com/office/word/2015/wordml/symex" xmlns:wpg="http://schemas.microsoft.com/office/word/2010/wordprocessingGroup" xmlns:wpi="http://schemas.microsoft.com/office/word/2010/wordprocessingInk" xmlns:wne="http://schemas.microsoft.com/office/word/2006/wordml" xmlns:wps="http://schemas.microsoft.com/office/word/2010/wordprocessingShape" mc:Ignorable="w14 w15 w16se wp14">
+<w:document xmlns:wpc="http://schemas.microsoft.com/office/word/2010/wordprocessingCanvas" xmlns:cx="http://schemas.microsoft.com/office/drawing/2014/chartex" xmlns:cx1="http://schemas.microsoft.com/office/drawing/2015/9/8/chartex" xmlns:cx2="http://schemas.microsoft.com/office/drawing/2015/10/21/chartex" xmlns:cx3="http://schemas.microsoft.com/office/drawing/2016/5/9/chartex" xmlns:cx4="http://schemas.microsoft.com/office/drawing/2016/5/10/chartex" xmlns:cx5="http://schemas.microsoft.com/office/drawing/2016/5/11/chartex" xmlns:cx6="http://schemas.microsoft.com/office/drawing/2016/5/12/chartex" xmlns:cx7="http://schemas.microsoft.com/office/drawing/2016/5/13/chartex" xmlns:cx8="http://schemas.microsoft.com/office/drawing/2016/5/14/chartex" xmlns:mc="http://schemas.openxmlformats.org/markup-compatibility/2006" xmlns:aink="http://schemas.microsoft.com/office/drawing/2016/ink" xmlns:am3d="http://schemas.microsoft.com/office/drawing/2017/model3d" xmlns:o="urn:schemas-microsoft-com:office:office" xmlns:oel="http://schemas.microsoft.com/office/2019/extlst" xmlns:r="http://schemas.openxmlformats.org/officeDocument/2006/relationships" xmlns:m="http://schemas.openxmlformats.org/officeDocument/2006/math" xmlns:v="urn:schemas-microsoft-com:vml" xmlns:wp14="http://schemas.microsoft.com/office/word/2010/wordprocessingDrawing" xmlns:wp="http://schemas.openxmlformats.org/drawingml/2006/wordprocessingDrawing" xmlns:w10="urn:schemas-microsoft-com:office:word" xmlns:w="http://schemas.openxmlformats.org/wordprocessingml/2006/main" xmlns:w14="http://schemas.microsoft.com/office/word/2010/wordml" xmlns:w15="http://schemas.microsoft.com/office/word/2012/wordml" xmlns:w16cex="http://schemas.microsoft.com/office/word/2018/wordml/cex" xmlns:w16cid="http://schemas.microsoft.com/office/word/2016/wordml/cid" xmlns:w16="http://schemas.microsoft.com/office/word/2018/wordml" xmlns:w16du="http://schemas.microsoft.com/office/word/2023/wordml/word16du" xmlns:w16sdtdh="http://schemas.microsoft.com/office/word/2020/wordml/sdtdatahash" xmlns:w16sdtfl="http://schemas.microsoft.com/office/word/2024/wordml/sdtformatlock" xmlns:w16se="http://schemas.microsoft.com/office/word/2015/wordml/symex" xmlns:wpg="http://schemas.microsoft.com/office/word/2010/wordprocessingGroup" xmlns:wpi="http://schemas.microsoft.com/office/word/2010/wordprocessingInk" xmlns:wne="http://schemas.microsoft.com/office/word/2006/wordml" xmlns:wps="http://schemas.microsoft.com/office/word/2010/wordprocessingShape" mc:Ignorable="w14 w15 w16se w16cid w16 w16cex w16sdtdh w16sdtfl w16du wp14">
   <w:body>
     <w:p>
       <w:pPr>
@@ -162,7 +162,6 @@
             <w:pPr>
               <w:pStyle w:val="Heading2"/>
               <w:spacing w:before="0" w:after="0"/>
-              <w:outlineLvl w:val="1"/>
               <w:rPr>
                 <w:rFonts w:ascii="Arial" w:hAnsi="Arial" w:cs="Arial"/>
               </w:rPr>
@@ -367,117 +366,32 @@
                 <w:sz w:val="36"/>
                 <w:szCs w:val="36"/>
               </w:rPr>
-              <w:t>3046</w:t>
-            </w:r>
-            <w:r>
-              <w:rPr>
+              <w:t>RC</w:t>
+            </w:r>
+            <w:r>
+              <w:rPr>
+                <w:sz w:val="36"/>
+                <w:szCs w:val="36"/>
+              </w:rPr>
+              <w:t>4558</w:t>
+            </w:r>
+            <w:r>
+              <w:rPr>
+                <w:rFonts w:ascii="Segoe UI Symbol" w:hAnsi="Segoe UI Symbol" w:cs="Segoe UI Symbol"/>
+                <w:sz w:val="36"/>
+                <w:szCs w:val="36"/>
+              </w:rPr>
+              <w:t>⁠</w:t>
+            </w:r>
+            <w:r>
+              <w:rPr>
+                <w:rFonts w:ascii="Segoe UI Symbol" w:hAnsi="Segoe UI Symbol" w:cs="Segoe UI Symbol"/>
                 <w:sz w:val="36"/>
                 <w:szCs w:val="36"/>
               </w:rPr>
               <w:t xml:space="preserve"> </w:t>
             </w:r>
-            <w:r>
-              <w:rPr>
-                <w:rFonts w:ascii="Segoe UI Symbol" w:hAnsi="Segoe UI Symbol" w:cs="Segoe UI Symbol"/>
-                <w:sz w:val="36"/>
-                <w:szCs w:val="36"/>
-              </w:rPr>
-              <w:t>⁠</w:t>
-            </w:r>
-            <w:hyperlink r:id="rId11" w:tooltip="https://www.alldatasheet.com/datasheet-pdf/pdf/837704/TI1/LM3046.html" w:history="1">
-              <w:r>
-                <w:rPr>
-                  <w:rStyle w:val="Hyperlink"/>
-                  <w:sz w:val="36"/>
-                  <w:szCs w:val="36"/>
-                </w:rPr>
-                <w:t>LM3046 Texas Instruments</w:t>
-              </w:r>
-            </w:hyperlink>
-          </w:p>
-        </w:tc>
-        <w:tc>
-          <w:tcPr>
-            <w:tcW w:w="4675" w:type="dxa"/>
-          </w:tcPr>
-          <w:p>
-            <w:pPr>
-              <w:rPr>
-                <w:sz w:val="36"/>
-                <w:szCs w:val="36"/>
-              </w:rPr>
-            </w:pPr>
-            <w:r>
-              <w:rPr>
-                <w:sz w:val="36"/>
-                <w:szCs w:val="36"/>
-              </w:rPr>
-              <w:t>CA3046</w:t>
-            </w:r>
-            <w:r>
-              <w:rPr>
-                <w:sz w:val="36"/>
-                <w:szCs w:val="36"/>
-              </w:rPr>
-              <w:t xml:space="preserve"> </w:t>
-            </w:r>
-            <w:r>
-              <w:rPr>
-                <w:rFonts w:ascii="Segoe UI Symbol" w:hAnsi="Segoe UI Symbol" w:cs="Segoe UI Symbol"/>
-                <w:sz w:val="36"/>
-                <w:szCs w:val="36"/>
-              </w:rPr>
-              <w:t>⁠</w:t>
-            </w:r>
-            <w:hyperlink r:id="rId12" w:tooltip="https://www.alldatasheet.com/datasheet-pdf/pdf/66311/INTERSIL/CA3046.html" w:history="1">
-              <w:r>
-                <w:rPr>
-                  <w:rStyle w:val="Hyperlink"/>
-                  <w:sz w:val="36"/>
-                  <w:szCs w:val="36"/>
-                </w:rPr>
-                <w:t>CA3046 Datasheet</w:t>
-              </w:r>
-            </w:hyperlink>
-          </w:p>
-        </w:tc>
-      </w:tr>
-      <w:tr>
-        <w:tc>
-          <w:tcPr>
-            <w:tcW w:w="4675" w:type="dxa"/>
-          </w:tcPr>
-          <w:p>
-            <w:pPr>
-              <w:rPr>
-                <w:sz w:val="36"/>
-                <w:szCs w:val="36"/>
-              </w:rPr>
-            </w:pPr>
-            <w:r>
-              <w:rPr>
-                <w:sz w:val="36"/>
-                <w:szCs w:val="36"/>
-              </w:rPr>
-              <w:t>4558</w:t>
-            </w:r>
-            <w:r>
-              <w:rPr>
-                <w:rFonts w:ascii="Segoe UI Symbol" w:hAnsi="Segoe UI Symbol" w:cs="Segoe UI Symbol"/>
-                <w:sz w:val="36"/>
-                <w:szCs w:val="36"/>
-              </w:rPr>
-              <w:t>⁠</w:t>
-            </w:r>
-            <w:r>
-              <w:rPr>
-                <w:rFonts w:ascii="Segoe UI Symbol" w:hAnsi="Segoe UI Symbol" w:cs="Segoe UI Symbol"/>
-                <w:sz w:val="36"/>
-                <w:szCs w:val="36"/>
-              </w:rPr>
-              <w:t xml:space="preserve"> </w:t>
-            </w:r>
-            <w:hyperlink r:id="rId13" w:tooltip="https://www.ti.com/lit/ds/symlink/rc4558.pdf" w:history="1">
+            <w:hyperlink r:id="rId11" w:tooltip="https://www.ti.com/lit/ds/symlink/rc4558.pdf" w:history="1">
               <w:r>
                 <w:rPr>
                   <w:rStyle w:val="Hyperlink"/>
@@ -525,7 +439,7 @@
               </w:rPr>
               <w:t>⁠</w:t>
             </w:r>
-            <w:hyperlink r:id="rId14" w:tooltip="https://www.ti.com/lit/ds/symlink/ne5532.pdf" w:history="1">
+            <w:hyperlink r:id="rId12" w:tooltip="https://www.ti.com/lit/ds/symlink/ne5532.pdf" w:history="1">
               <w:r>
                 <w:rPr>
                   <w:rStyle w:val="Hyperlink"/>
@@ -572,7 +486,7 @@
               </w:rPr>
               <w:t>⁠</w:t>
             </w:r>
-            <w:hyperlink r:id="rId15" w:tooltip="https://www.ti.com/product/TL081" w:history="1">
+            <w:hyperlink r:id="rId13" w:tooltip="https://www.ti.com/product/TL081" w:history="1">
               <w:r>
                 <w:rPr>
                   <w:rStyle w:val="Hyperlink"/>
@@ -617,7 +531,7 @@
               </w:rPr>
               <w:t>⁠</w:t>
             </w:r>
-            <w:hyperlink r:id="rId16" w:tooltip="https://www.alldatasheet.com/datasheet-pdf/pdf/83610/AD/AD8066.html" w:history="1">
+            <w:hyperlink r:id="rId14" w:tooltip="https://www.alldatasheet.com/datasheet-pdf/pdf/83610/AD/AD8066.html" w:history="1">
               <w:r>
                 <w:rPr>
                   <w:rStyle w:val="Hyperlink"/>
@@ -664,7 +578,7 @@
               </w:rPr>
               <w:t>⁠</w:t>
             </w:r>
-            <w:hyperlink r:id="rId17" w:tooltip="https://www.alldatasheet.com/datasheet-pdf/pdf/172044/ONSEMI/LM393.html" w:history="1">
+            <w:hyperlink r:id="rId15" w:tooltip="https://www.alldatasheet.com/datasheet-pdf/pdf/172044/ONSEMI/LM393.html" w:history="1">
               <w:r>
                 <w:rPr>
                   <w:rStyle w:val="Hyperlink"/>
@@ -692,7 +606,7 @@
                 <w:sz w:val="36"/>
                 <w:szCs w:val="36"/>
               </w:rPr>
-              <w:t>LM393BIPWR</w:t>
+              <w:t>LT1011CN8</w:t>
             </w:r>
             <w:r>
               <w:rPr>
@@ -701,22 +615,129 @@
               </w:rPr>
               <w:t xml:space="preserve"> </w:t>
             </w:r>
-            <w:r>
-              <w:rPr>
-                <w:rFonts w:ascii="Segoe UI Symbol" w:hAnsi="Segoe UI Symbol" w:cs="Segoe UI Symbol"/>
-                <w:sz w:val="36"/>
-                <w:szCs w:val="36"/>
-              </w:rPr>
-              <w:t>⁠</w:t>
-            </w:r>
-            <w:hyperlink r:id="rId18" w:tooltip="https://www.ti.com/lit/ds/symlink/lm2903b.pdf?ts=1776713310688" w:history="1">
+            <w:hyperlink r:id="rId16" w:history="1">
+              <w:proofErr w:type="spellStart"/>
               <w:r>
                 <w:rPr>
                   <w:rStyle w:val="Hyperlink"/>
                   <w:sz w:val="36"/>
                   <w:szCs w:val="36"/>
                 </w:rPr>
-                <w:t>LM393B, LM2903B, LM193, LM293, LM393 and LM2903 Dual Comparators datasheet</w:t>
+                <w:t>LT1011CN8</w:t>
+              </w:r>
+              <w:proofErr w:type="spellEnd"/>
+              <w:r>
+                <w:rPr>
+                  <w:rStyle w:val="Hyperlink"/>
+                  <w:sz w:val="36"/>
+                  <w:szCs w:val="36"/>
+                </w:rPr>
+                <w:t xml:space="preserve"> </w:t>
+              </w:r>
+              <w:proofErr w:type="gramStart"/>
+              <w:r>
+                <w:rPr>
+                  <w:rStyle w:val="Hyperlink"/>
+                  <w:sz w:val="36"/>
+                  <w:szCs w:val="36"/>
+                </w:rPr>
+                <w:t>Datasheet(</w:t>
+              </w:r>
+              <w:proofErr w:type="gramEnd"/>
+              <w:r>
+                <w:rPr>
+                  <w:rStyle w:val="Hyperlink"/>
+                  <w:sz w:val="36"/>
+                  <w:szCs w:val="36"/>
+                </w:rPr>
+                <w:t>PDF) - Linear Technology</w:t>
+              </w:r>
+            </w:hyperlink>
+          </w:p>
+        </w:tc>
+      </w:tr>
+      <w:tr>
+        <w:tc>
+          <w:tcPr>
+            <w:tcW w:w="4675" w:type="dxa"/>
+          </w:tcPr>
+          <w:p>
+            <w:pPr>
+              <w:rPr>
+                <w:sz w:val="36"/>
+                <w:szCs w:val="36"/>
+              </w:rPr>
+            </w:pPr>
+            <w:r>
+              <w:rPr>
+                <w:sz w:val="36"/>
+                <w:szCs w:val="36"/>
+              </w:rPr>
+              <w:t>E112 (J112)</w:t>
+            </w:r>
+            <w:r>
+              <w:rPr>
+                <w:sz w:val="36"/>
+                <w:szCs w:val="36"/>
+              </w:rPr>
+              <w:t xml:space="preserve"> </w:t>
+            </w:r>
+            <w:r>
+              <w:rPr>
+                <w:rFonts w:ascii="Segoe UI Symbol" w:hAnsi="Segoe UI Symbol" w:cs="Segoe UI Symbol"/>
+                <w:sz w:val="36"/>
+                <w:szCs w:val="36"/>
+              </w:rPr>
+              <w:t>⁠</w:t>
+            </w:r>
+            <w:hyperlink r:id="rId17" w:tooltip="https://www.alldatasheet.com/html-pdf/467500/ONSEMI/J112/213/1/J112.html" w:history="1">
+              <w:r>
+                <w:rPr>
+                  <w:rStyle w:val="Hyperlink"/>
+                  <w:sz w:val="36"/>
+                  <w:szCs w:val="36"/>
+                </w:rPr>
+                <w:t>J112 datasheet</w:t>
+              </w:r>
+            </w:hyperlink>
+          </w:p>
+        </w:tc>
+        <w:tc>
+          <w:tcPr>
+            <w:tcW w:w="4675" w:type="dxa"/>
+          </w:tcPr>
+          <w:p>
+            <w:pPr>
+              <w:tabs>
+                <w:tab w:val="left" w:pos="1263"/>
+              </w:tabs>
+              <w:rPr>
+                <w:sz w:val="36"/>
+                <w:szCs w:val="36"/>
+              </w:rPr>
+            </w:pPr>
+            <w:r>
+              <w:rPr>
+                <w:sz w:val="36"/>
+                <w:szCs w:val="36"/>
+              </w:rPr>
+              <w:t>BF256C</w:t>
+            </w:r>
+            <w:r>
+              <w:rPr>
+                <w:sz w:val="36"/>
+                <w:szCs w:val="36"/>
+              </w:rPr>
+              <w:t xml:space="preserve"> </w:t>
+            </w:r>
+            <w:hyperlink r:id="rId18" w:tgtFrame="_blank" w:tooltip="https://www.mouser.com/datasheet/2/149/bf256b-292516.pdf" w:history="1">
+              <w:r>
+                <w:rPr>
+                  <w:rStyle w:val="Hyperlink"/>
+                  <w:sz w:val="36"/>
+                  <w:szCs w:val="36"/>
+                </w:rPr>
+                <w:t>BF256A/BF256B/BF256C N-Channel RF Amplifiers</w:t>
               </w:r>
             </w:hyperlink>
           </w:p>
@@ -1042,6 +1063,7 @@
     <w:p/>
     <w:p/>
     <w:p/>
+    <w:p/>
     <w:p>
       <w:pPr>
         <w:pStyle w:val="ListParagraph"/>
@@ -1052,7 +1074,6 @@
       </w:pPr>
       <w:proofErr w:type="spellStart"/>
       <w:r>
-        <w:lastRenderedPageBreak/>
         <w:t>Zamena</w:t>
       </w:r>
       <w:proofErr w:type="spellEnd"/>
@@ -1062,11 +1083,12 @@
       <w:r>
         <w:t>LT1011CN8</w:t>
       </w:r>
-      <w:bookmarkStart w:id="0" w:name="_GoBack"/>
-      <w:bookmarkEnd w:id="0"/>
     </w:p>
     <w:p>
       <w:r>
+        <w:rPr>
+          <w:noProof/>
+        </w:rPr>
         <w:drawing>
           <wp:inline distT="0" distB="0" distL="0" distR="0" wp14:anchorId="062E40CE" wp14:editId="76D9BFB2">
             <wp:extent cx="5943600" cy="4025265"/>
@@ -1104,10 +1126,371 @@
         </w:drawing>
       </w:r>
     </w:p>
+    <w:p/>
+    <w:p/>
+    <w:p>
+      <w:pPr>
+        <w:pStyle w:val="ListParagraph"/>
+        <w:numPr>
+          <w:ilvl w:val="0"/>
+          <w:numId w:val="1"/>
+        </w:numPr>
+      </w:pPr>
+      <w:r>
+        <w:lastRenderedPageBreak/>
+        <w:drawing>
+          <wp:anchor distT="0" distB="0" distL="114300" distR="114300" simplePos="0" relativeHeight="251658240" behindDoc="0" locked="0" layoutInCell="1" allowOverlap="1" wp14:anchorId="7EF21D46" wp14:editId="0EE227FE">
+            <wp:simplePos x="0" y="0"/>
+            <wp:positionH relativeFrom="page">
+              <wp:align>left</wp:align>
+            </wp:positionH>
+            <wp:positionV relativeFrom="paragraph">
+              <wp:posOffset>218161</wp:posOffset>
+            </wp:positionV>
+            <wp:extent cx="7785100" cy="3181985"/>
+            <wp:effectExtent l="0" t="0" r="6350" b="0"/>
+            <wp:wrapSquare wrapText="bothSides"/>
+            <wp:docPr id="1307281196" name="Picture 1" descr="A screenshot of a computer screen&#10;&#10;AI-generated content may be incorrect."/>
+            <wp:cNvGraphicFramePr>
+              <a:graphicFrameLocks xmlns:a="http://schemas.openxmlformats.org/drawingml/2006/main" noChangeAspect="1"/>
+            </wp:cNvGraphicFramePr>
+            <a:graphic xmlns:a="http://schemas.openxmlformats.org/drawingml/2006/main">
+              <a:graphicData uri="http://schemas.openxmlformats.org/drawingml/2006/picture">
+                <pic:pic xmlns:pic="http://schemas.openxmlformats.org/drawingml/2006/picture">
+                  <pic:nvPicPr>
+                    <pic:cNvPr id="1307281196" name="Picture 1" descr="A screenshot of a computer screen&#10;&#10;AI-generated content may be incorrect."/>
+                    <pic:cNvPicPr/>
+                  </pic:nvPicPr>
+                  <pic:blipFill>
+                    <a:blip r:embed="rId25">
+                      <a:extLst>
+                        <a:ext uri="{28A0092B-C50C-407E-A947-70E740481C1C}">
+                          <a14:useLocalDpi xmlns:a14="http://schemas.microsoft.com/office/drawing/2010/main" val="0"/>
+                        </a:ext>
+                      </a:extLst>
+                    </a:blip>
+                    <a:stretch>
+                      <a:fillRect/>
+                    </a:stretch>
+                  </pic:blipFill>
+                  <pic:spPr>
+                    <a:xfrm>
+                      <a:off x="0" y="0"/>
+                      <a:ext cx="7791656" cy="3184708"/>
+                    </a:xfrm>
+                    <a:prstGeom prst="rect">
+                      <a:avLst/>
+                    </a:prstGeom>
+                  </pic:spPr>
+                </pic:pic>
+              </a:graphicData>
+            </a:graphic>
+            <wp14:sizeRelH relativeFrom="margin">
+              <wp14:pctWidth>0</wp14:pctWidth>
+            </wp14:sizeRelH>
+            <wp14:sizeRelV relativeFrom="margin">
+              <wp14:pctHeight>0</wp14:pctHeight>
+            </wp14:sizeRelV>
+          </wp:anchor>
+        </w:drawing>
+      </w:r>
+      <w:proofErr w:type="spellStart"/>
+      <w:r>
+        <w:t>Zamena</w:t>
+      </w:r>
+      <w:proofErr w:type="spellEnd"/>
+      <w:r>
+        <w:t xml:space="preserve"> za J</w:t>
+      </w:r>
+      <w:proofErr w:type="gramStart"/>
+      <w:r>
+        <w:t>112  je</w:t>
+      </w:r>
+      <w:proofErr w:type="gramEnd"/>
+      <w:r>
+        <w:t xml:space="preserve"> BF256</w:t>
+      </w:r>
+      <w:r>
+        <w:t>C</w:t>
+      </w:r>
+    </w:p>
+    <w:p>
+      <w:pPr>
+        <w:pStyle w:val="ListParagraph"/>
+      </w:pPr>
+    </w:p>
+    <w:tbl>
+      <w:tblPr>
+        <w:tblStyle w:val="TableGrid"/>
+        <w:tblW w:w="0" w:type="auto"/>
+        <w:tblLook w:val="04A0" w:firstRow="1" w:lastRow="0" w:firstColumn="1" w:lastColumn="0" w:noHBand="0" w:noVBand="1"/>
+      </w:tblPr>
+      <w:tblGrid>
+        <w:gridCol w:w="3116"/>
+        <w:gridCol w:w="3117"/>
+        <w:gridCol w:w="3117"/>
+      </w:tblGrid>
+      <w:tr>
+        <w:tc>
+          <w:tcPr>
+            <w:tcW w:w="3116" w:type="dxa"/>
+          </w:tcPr>
+          <w:p>
+            <w:pPr>
+              <w:jc w:val="center"/>
+              <w:rPr>
+                <w:b/>
+                <w:bCs/>
+              </w:rPr>
+            </w:pPr>
+            <w:proofErr w:type="spellStart"/>
+            <w:r>
+              <w:rPr>
+                <w:b/>
+                <w:bCs/>
+              </w:rPr>
+              <w:t>Parametar</w:t>
+            </w:r>
+            <w:proofErr w:type="spellEnd"/>
+          </w:p>
+        </w:tc>
+        <w:tc>
+          <w:tcPr>
+            <w:tcW w:w="3117" w:type="dxa"/>
+          </w:tcPr>
+          <w:p>
+            <w:pPr>
+              <w:jc w:val="center"/>
+              <w:rPr>
+                <w:b/>
+                <w:bCs/>
+              </w:rPr>
+            </w:pPr>
+            <w:r>
+              <w:rPr>
+                <w:b/>
+                <w:bCs/>
+              </w:rPr>
+              <w:t>J112</w:t>
+            </w:r>
+          </w:p>
+        </w:tc>
+        <w:tc>
+          <w:tcPr>
+            <w:tcW w:w="3117" w:type="dxa"/>
+          </w:tcPr>
+          <w:p>
+            <w:pPr>
+              <w:jc w:val="center"/>
+              <w:rPr>
+                <w:b/>
+                <w:bCs/>
+              </w:rPr>
+            </w:pPr>
+            <w:r>
+              <w:rPr>
+                <w:b/>
+                <w:bCs/>
+              </w:rPr>
+              <w:t>BF256C</w:t>
+            </w:r>
+          </w:p>
+        </w:tc>
+      </w:tr>
+      <w:tr>
+        <w:tc>
+          <w:tcPr>
+            <w:tcW w:w="3116" w:type="dxa"/>
+          </w:tcPr>
+          <w:p>
+            <w:pPr>
+              <w:jc w:val="center"/>
+              <w:rPr>
+                <w:b/>
+                <w:bCs/>
+              </w:rPr>
+            </w:pPr>
+            <w:proofErr w:type="spellStart"/>
+            <w:r>
+              <w:rPr>
+                <w:b/>
+                <w:bCs/>
+              </w:rPr>
+              <w:t>Idss</w:t>
+            </w:r>
+            <w:proofErr w:type="spellEnd"/>
+          </w:p>
+        </w:tc>
+        <w:tc>
+          <w:tcPr>
+            <w:tcW w:w="3117" w:type="dxa"/>
+          </w:tcPr>
+          <w:p>
+            <w:pPr>
+              <w:jc w:val="center"/>
+            </w:pPr>
+            <w:r>
+              <w:t>20mA</w:t>
+            </w:r>
+          </w:p>
+        </w:tc>
+        <w:tc>
+          <w:tcPr>
+            <w:tcW w:w="3117" w:type="dxa"/>
+          </w:tcPr>
+          <w:p>
+            <w:pPr>
+              <w:jc w:val="center"/>
+            </w:pPr>
+            <w:r>
+              <w:t>11 do 18 mA</w:t>
+            </w:r>
+          </w:p>
+        </w:tc>
+      </w:tr>
+      <w:tr>
+        <w:tc>
+          <w:tcPr>
+            <w:tcW w:w="3116" w:type="dxa"/>
+          </w:tcPr>
+          <w:p>
+            <w:pPr>
+              <w:jc w:val="center"/>
+              <w:rPr>
+                <w:b/>
+                <w:bCs/>
+              </w:rPr>
+            </w:pPr>
+            <w:proofErr w:type="spellStart"/>
+            <w:r>
+              <w:rPr>
+                <w:b/>
+                <w:bCs/>
+              </w:rPr>
+              <w:t>Vgs</w:t>
+            </w:r>
+            <w:proofErr w:type="spellEnd"/>
+            <w:r>
+              <w:rPr>
+                <w:b/>
+                <w:bCs/>
+              </w:rPr>
+              <w:t>(off)</w:t>
+            </w:r>
+          </w:p>
+        </w:tc>
+        <w:tc>
+          <w:tcPr>
+            <w:tcW w:w="3117" w:type="dxa"/>
+          </w:tcPr>
+          <w:p>
+            <w:pPr>
+              <w:jc w:val="center"/>
+            </w:pPr>
+            <w:r>
+              <w:t>-3 do -5</w:t>
+            </w:r>
+          </w:p>
+        </w:tc>
+        <w:tc>
+          <w:tcPr>
+            <w:tcW w:w="3117" w:type="dxa"/>
+          </w:tcPr>
+          <w:p>
+            <w:pPr>
+              <w:jc w:val="center"/>
+            </w:pPr>
+            <w:r>
+              <w:t>-0.5 do -8 V</w:t>
+            </w:r>
+          </w:p>
+        </w:tc>
+      </w:tr>
+      <w:tr>
+        <w:tc>
+          <w:tcPr>
+            <w:tcW w:w="3116" w:type="dxa"/>
+          </w:tcPr>
+          <w:p>
+            <w:pPr>
+              <w:jc w:val="center"/>
+              <w:rPr>
+                <w:b/>
+                <w:bCs/>
+              </w:rPr>
+            </w:pPr>
+            <w:proofErr w:type="spellStart"/>
+            <w:r>
+              <w:rPr>
+                <w:b/>
+                <w:bCs/>
+              </w:rPr>
+              <w:t>Rds</w:t>
+            </w:r>
+            <w:proofErr w:type="spellEnd"/>
+            <w:r>
+              <w:rPr>
+                <w:b/>
+                <w:bCs/>
+              </w:rPr>
+              <w:t>(on)</w:t>
+            </w:r>
+          </w:p>
+        </w:tc>
+        <w:tc>
+          <w:tcPr>
+            <w:tcW w:w="3117" w:type="dxa"/>
+          </w:tcPr>
+          <w:p>
+            <w:pPr>
+              <w:jc w:val="center"/>
+            </w:pPr>
+            <w:r>
+              <w:t>100</w:t>
+            </w:r>
+            <w:r>
+              <w:t xml:space="preserve"> </w:t>
+            </w:r>
+            <w:r>
+              <w:t>Ω</w:t>
+            </w:r>
+          </w:p>
+        </w:tc>
+        <w:tc>
+          <w:tcPr>
+            <w:tcW w:w="3117" w:type="dxa"/>
+          </w:tcPr>
+          <w:p>
+            <w:pPr>
+              <w:jc w:val="center"/>
+            </w:pPr>
+            <w:r>
+              <w:t>(111-</w:t>
+            </w:r>
+            <w:r>
+              <w:t>1</w:t>
+            </w:r>
+            <w:r>
+              <w:t>3</w:t>
+            </w:r>
+            <w:r>
+              <w:t>0</w:t>
+            </w:r>
+            <w:r>
+              <w:t>)</w:t>
+            </w:r>
+            <w:r>
+              <w:t xml:space="preserve"> Ω</w:t>
+            </w:r>
+          </w:p>
+        </w:tc>
+      </w:tr>
+    </w:tbl>
+    <w:p/>
     <w:sectPr>
-      <w:footerReference w:type="even" r:id="rId25"/>
-      <w:footerReference w:type="default" r:id="rId26"/>
-      <w:footerReference w:type="first" r:id="rId27"/>
+      <w:footerReference w:type="even" r:id="rId26"/>
+      <w:footerReference w:type="default" r:id="rId27"/>
+      <w:footerReference w:type="first" r:id="rId28"/>
       <w:pgSz w:w="12240" w:h="15840"/>
       <w:pgMar w:top="1440" w:right="1440" w:bottom="1440" w:left="1440" w:header="720" w:footer="720" w:gutter="0"/>
       <w:cols w:space="720"/>
@@ -1118,7 +1501,7 @@
 </file>
 
 <file path=word/endnotes.xml><?xml version="1.0" encoding="utf-8"?>
-<w:endnotes xmlns:wpc="http://schemas.microsoft.com/office/word/2010/wordprocessingCanvas" xmlns:cx="http://schemas.microsoft.com/office/drawing/2014/chartex" xmlns:cx1="http://schemas.microsoft.com/office/drawing/2015/9/8/chartex" xmlns:mc="http://schemas.openxmlformats.org/markup-compatibility/2006" xmlns:o="urn:schemas-microsoft-com:office:office" xmlns:r="http://schemas.openxmlformats.org/officeDocument/2006/relationships" xmlns:m="http://schemas.openxmlformats.org/officeDocument/2006/math" xmlns:v="urn:schemas-microsoft-com:vml" xmlns:wp14="http://schemas.microsoft.com/office/word/2010/wordprocessingDrawing" xmlns:wp="http://schemas.openxmlformats.org/drawingml/2006/wordprocessingDrawing" xmlns:w10="urn:schemas-microsoft-com:office:word" xmlns:w="http://schemas.openxmlformats.org/wordprocessingml/2006/main" xmlns:w14="http://schemas.microsoft.com/office/word/2010/wordml" xmlns:w15="http://schemas.microsoft.com/office/word/2012/wordml" xmlns:w16se="http://schemas.microsoft.com/office/word/2015/wordml/symex" xmlns:wpg="http://schemas.microsoft.com/office/word/2010/wordprocessingGroup" xmlns:wpi="http://schemas.microsoft.com/office/word/2010/wordprocessingInk" xmlns:wne="http://schemas.microsoft.com/office/word/2006/wordml" xmlns:wps="http://schemas.microsoft.com/office/word/2010/wordprocessingShape" mc:Ignorable="w14 w15 w16se wp14">
+<w:endnotes xmlns:wpc="http://schemas.microsoft.com/office/word/2010/wordprocessingCanvas" xmlns:cx="http://schemas.microsoft.com/office/drawing/2014/chartex" xmlns:cx1="http://schemas.microsoft.com/office/drawing/2015/9/8/chartex" xmlns:cx2="http://schemas.microsoft.com/office/drawing/2015/10/21/chartex" xmlns:cx3="http://schemas.microsoft.com/office/drawing/2016/5/9/chartex" xmlns:cx4="http://schemas.microsoft.com/office/drawing/2016/5/10/chartex" xmlns:cx5="http://schemas.microsoft.com/office/drawing/2016/5/11/chartex" xmlns:cx6="http://schemas.microsoft.com/office/drawing/2016/5/12/chartex" xmlns:cx7="http://schemas.microsoft.com/office/drawing/2016/5/13/chartex" xmlns:cx8="http://schemas.microsoft.com/office/drawing/2016/5/14/chartex" xmlns:mc="http://schemas.openxmlformats.org/markup-compatibility/2006" xmlns:aink="http://schemas.microsoft.com/office/drawing/2016/ink" xmlns:am3d="http://schemas.microsoft.com/office/drawing/2017/model3d" xmlns:o="urn:schemas-microsoft-com:office:office" xmlns:oel="http://schemas.microsoft.com/office/2019/extlst" xmlns:r="http://schemas.openxmlformats.org/officeDocument/2006/relationships" xmlns:m="http://schemas.openxmlformats.org/officeDocument/2006/math" xmlns:v="urn:schemas-microsoft-com:vml" xmlns:wp14="http://schemas.microsoft.com/office/word/2010/wordprocessingDrawing" xmlns:wp="http://schemas.openxmlformats.org/drawingml/2006/wordprocessingDrawing" xmlns:w10="urn:schemas-microsoft-com:office:word" xmlns:w="http://schemas.openxmlformats.org/wordprocessingml/2006/main" xmlns:w14="http://schemas.microsoft.com/office/word/2010/wordml" xmlns:w15="http://schemas.microsoft.com/office/word/2012/wordml" xmlns:w16cex="http://schemas.microsoft.com/office/word/2018/wordml/cex" xmlns:w16cid="http://schemas.microsoft.com/office/word/2016/wordml/cid" xmlns:w16="http://schemas.microsoft.com/office/word/2018/wordml" xmlns:w16du="http://schemas.microsoft.com/office/word/2023/wordml/word16du" xmlns:w16sdtdh="http://schemas.microsoft.com/office/word/2020/wordml/sdtdatahash" xmlns:w16sdtfl="http://schemas.microsoft.com/office/word/2024/wordml/sdtformatlock" xmlns:w16se="http://schemas.microsoft.com/office/word/2015/wordml/symex" xmlns:wpg="http://schemas.microsoft.com/office/word/2010/wordprocessingGroup" xmlns:wpi="http://schemas.microsoft.com/office/word/2010/wordprocessingInk" xmlns:wne="http://schemas.microsoft.com/office/word/2006/wordml" xmlns:wps="http://schemas.microsoft.com/office/word/2010/wordprocessingShape" mc:Ignorable="w14 w15 w16se w16cid w16 w16cex w16sdtdh w16sdtfl w16du wp14">
   <w:endnote w:type="separator" w:id="-1">
     <w:p>
       <w:pPr>
@@ -1143,7 +1526,7 @@
 </file>
 
 <file path=word/footer1.xml><?xml version="1.0" encoding="utf-8"?>
-<w:ftr xmlns:wpc="http://schemas.microsoft.com/office/word/2010/wordprocessingCanvas" xmlns:cx="http://schemas.microsoft.com/office/drawing/2014/chartex" xmlns:cx1="http://schemas.microsoft.com/office/drawing/2015/9/8/chartex" xmlns:mc="http://schemas.openxmlformats.org/markup-compatibility/2006" xmlns:o="urn:schemas-microsoft-com:office:office" xmlns:r="http://schemas.openxmlformats.org/officeDocument/2006/relationships" xmlns:m="http://schemas.openxmlformats.org/officeDocument/2006/math" xmlns:v="urn:schemas-microsoft-com:vml" xmlns:wp14="http://schemas.microsoft.com/office/word/2010/wordprocessingDrawing" xmlns:wp="http://schemas.openxmlformats.org/drawingml/2006/wordprocessingDrawing" xmlns:w10="urn:schemas-microsoft-com:office:word" xmlns:w="http://schemas.openxmlformats.org/wordprocessingml/2006/main" xmlns:w14="http://schemas.microsoft.com/office/word/2010/wordml" xmlns:w15="http://schemas.microsoft.com/office/word/2012/wordml" xmlns:w16se="http://schemas.microsoft.com/office/word/2015/wordml/symex" xmlns:wpg="http://schemas.microsoft.com/office/word/2010/wordprocessingGroup" xmlns:wpi="http://schemas.microsoft.com/office/word/2010/wordprocessingInk" xmlns:wne="http://schemas.microsoft.com/office/word/2006/wordml" xmlns:wps="http://schemas.microsoft.com/office/word/2010/wordprocessingShape" mc:Ignorable="w14 w15 w16se wp14">
+<w:ftr xmlns:wpc="http://schemas.microsoft.com/office/word/2010/wordprocessingCanvas" xmlns:cx="http://schemas.microsoft.com/office/drawing/2014/chartex" xmlns:cx1="http://schemas.microsoft.com/office/drawing/2015/9/8/chartex" xmlns:cx2="http://schemas.microsoft.com/office/drawing/2015/10/21/chartex" xmlns:cx3="http://schemas.microsoft.com/office/drawing/2016/5/9/chartex" xmlns:cx4="http://schemas.microsoft.com/office/drawing/2016/5/10/chartex" xmlns:cx5="http://schemas.microsoft.com/office/drawing/2016/5/11/chartex" xmlns:cx6="http://schemas.microsoft.com/office/drawing/2016/5/12/chartex" xmlns:cx7="http://schemas.microsoft.com/office/drawing/2016/5/13/chartex" xmlns:cx8="http://schemas.microsoft.com/office/drawing/2016/5/14/chartex" xmlns:mc="http://schemas.openxmlformats.org/markup-compatibility/2006" xmlns:aink="http://schemas.microsoft.com/office/drawing/2016/ink" xmlns:am3d="http://schemas.microsoft.com/office/drawing/2017/model3d" xmlns:o="urn:schemas-microsoft-com:office:office" xmlns:oel="http://schemas.microsoft.com/office/2019/extlst" xmlns:r="http://schemas.openxmlformats.org/officeDocument/2006/relationships" xmlns:m="http://schemas.openxmlformats.org/officeDocument/2006/math" xmlns:v="urn:schemas-microsoft-com:vml" xmlns:wp14="http://schemas.microsoft.com/office/word/2010/wordprocessingDrawing" xmlns:wp="http://schemas.openxmlformats.org/drawingml/2006/wordprocessingDrawing" xmlns:w10="urn:schemas-microsoft-com:office:word" xmlns:w="http://schemas.openxmlformats.org/wordprocessingml/2006/main" xmlns:w14="http://schemas.microsoft.com/office/word/2010/wordml" xmlns:w15="http://schemas.microsoft.com/office/word/2012/wordml" xmlns:w16cex="http://schemas.microsoft.com/office/word/2018/wordml/cex" xmlns:w16cid="http://schemas.microsoft.com/office/word/2016/wordml/cid" xmlns:w16="http://schemas.microsoft.com/office/word/2018/wordml" xmlns:w16du="http://schemas.microsoft.com/office/word/2023/wordml/word16du" xmlns:w16sdtdh="http://schemas.microsoft.com/office/word/2020/wordml/sdtdatahash" xmlns:w16sdtfl="http://schemas.microsoft.com/office/word/2024/wordml/sdtformatlock" xmlns:w16se="http://schemas.microsoft.com/office/word/2015/wordml/symex" xmlns:wpg="http://schemas.microsoft.com/office/word/2010/wordprocessingGroup" xmlns:wpi="http://schemas.microsoft.com/office/word/2010/wordprocessingInk" xmlns:wne="http://schemas.microsoft.com/office/word/2006/wordml" xmlns:wps="http://schemas.microsoft.com/office/word/2010/wordprocessingShape" mc:Ignorable="w14 w15 w16se w16cid w16 w16cex w16sdtdh w16sdtfl w16du wp14">
   <w:p>
     <w:pPr>
       <w:pStyle w:val="Footer"/>
@@ -1169,7 +1552,7 @@
               <wp:docPr id="1189448808" name="Text Box 2" descr="Internal">
                 <a:extLst xmlns:a="http://schemas.openxmlformats.org/drawingml/2006/main">
                   <a:ext uri="{5AE41FA2-C0FF-4470-9BD4-5FADCA87CBE2}">
-                    <aclsh:classification xmlns:aclsh="http://schemas.microsoft.com/office/drawing/2020/classificationShape" xmlns:w16sdtfl="http://schemas.microsoft.com/office/word/2024/wordml/sdtformatlock" xmlns:w16sdtdh="http://schemas.microsoft.com/office/word/2020/wordml/sdtdatahash" xmlns:w16du="http://schemas.microsoft.com/office/word/2023/wordml/word16du" xmlns:w16="http://schemas.microsoft.com/office/word/2018/wordml" xmlns:w16cid="http://schemas.microsoft.com/office/word/2016/wordml/cid" xmlns:w16cex="http://schemas.microsoft.com/office/word/2018/wordml/cex" xmlns:w="http://schemas.openxmlformats.org/wordprocessingml/2006/main" xmlns:w10="urn:schemas-microsoft-com:office:word" xmlns:v="urn:schemas-microsoft-com:vml" xmlns:oel="http://schemas.microsoft.com/office/2019/extlst" xmlns:o="urn:schemas-microsoft-com:office:office" xmlns:am3d="http://schemas.microsoft.com/office/drawing/2017/model3d" xmlns:aink="http://schemas.microsoft.com/office/drawing/2016/ink" xmlns:cx8="http://schemas.microsoft.com/office/drawing/2016/5/14/chartex" xmlns:cx7="http://schemas.microsoft.com/office/drawing/2016/5/13/chartex" xmlns:cx6="http://schemas.microsoft.com/office/drawing/2016/5/12/chartex" xmlns:cx5="http://schemas.microsoft.com/office/drawing/2016/5/11/chartex" xmlns:cx4="http://schemas.microsoft.com/office/drawing/2016/5/10/chartex" xmlns:cx3="http://schemas.microsoft.com/office/drawing/2016/5/9/chartex" xmlns:cx2="http://schemas.microsoft.com/office/drawing/2015/10/21/chartex" xmlns="" classificationOutcomeType="ftr"/>
+                    <aclsh:classification xmlns:aclsh="http://schemas.microsoft.com/office/drawing/2020/classificationShape" classificationOutcomeType="ftr"/>
                   </a:ext>
                 </a:extLst>
               </wp:docPr>
@@ -1229,14 +1612,13 @@
             </wp:anchor>
           </w:drawing>
         </mc:Choice>
-        <mc:Fallback xmlns:w16sdtfl="http://schemas.microsoft.com/office/word/2024/wordml/sdtformatlock" xmlns:w16sdtdh="http://schemas.microsoft.com/office/word/2020/wordml/sdtdatahash" xmlns:w16du="http://schemas.microsoft.com/office/word/2023/wordml/word16du" xmlns:w16="http://schemas.microsoft.com/office/word/2018/wordml" xmlns:w16cid="http://schemas.microsoft.com/office/word/2016/wordml/cid" xmlns:w16cex="http://schemas.microsoft.com/office/word/2018/wordml/cex" xmlns:oel="http://schemas.microsoft.com/office/2019/extlst" xmlns:am3d="http://schemas.microsoft.com/office/drawing/2017/model3d" xmlns:aink="http://schemas.microsoft.com/office/drawing/2016/ink" xmlns:cx8="http://schemas.microsoft.com/office/drawing/2016/5/14/chartex" xmlns:cx7="http://schemas.microsoft.com/office/drawing/2016/5/13/chartex" xmlns:cx6="http://schemas.microsoft.com/office/drawing/2016/5/12/chartex" xmlns:cx5="http://schemas.microsoft.com/office/drawing/2016/5/11/chartex" xmlns:cx4="http://schemas.microsoft.com/office/drawing/2016/5/10/chartex" xmlns:cx3="http://schemas.microsoft.com/office/drawing/2016/5/9/chartex" xmlns:cx2="http://schemas.microsoft.com/office/drawing/2015/10/21/chartex">
+        <mc:Fallback>
           <w:pict>
             <v:shapetype w14:anchorId="323963D6" id="_x0000_t202" coordsize="21600,21600" o:spt="202" path="m,l,21600r21600,l21600,xe">
               <v:stroke joinstyle="miter"/>
               <v:path gradientshapeok="t" o:connecttype="rect"/>
             </v:shapetype>
             <v:shape id="Text Box 2" o:spid="_x0000_s1026" type="#_x0000_t202" alt="Internal" style="position:absolute;margin-left:0;margin-top:0;width:25.4pt;height:26.3pt;z-index:251659264;visibility:visible;mso-wrap-style:none;mso-wrap-distance-left:0;mso-wrap-distance-top:0;mso-wrap-distance-right:0;mso-wrap-distance-bottom:0;mso-position-horizontal:center;mso-position-horizontal-relative:page;mso-position-vertical:bottom;mso-position-vertical-relative:page;v-text-anchor:bottom" o:gfxdata="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" filled="f" stroked="f">
-              <v:fill o:detectmouseclick="t"/>
               <v:textbox style="mso-fit-shape-to-text:t" inset="0,0,0,15pt">
                 <w:txbxContent>
                   <w:p>
@@ -1274,7 +1656,7 @@
 </file>
 
 <file path=word/footer2.xml><?xml version="1.0" encoding="utf-8"?>
-<w:ftr xmlns:wpc="http://schemas.microsoft.com/office/word/2010/wordprocessingCanvas" xmlns:cx="http://schemas.microsoft.com/office/drawing/2014/chartex" xmlns:cx1="http://schemas.microsoft.com/office/drawing/2015/9/8/chartex" xmlns:mc="http://schemas.openxmlformats.org/markup-compatibility/2006" xmlns:o="urn:schemas-microsoft-com:office:office" xmlns:r="http://schemas.openxmlformats.org/officeDocument/2006/relationships" xmlns:m="http://schemas.openxmlformats.org/officeDocument/2006/math" xmlns:v="urn:schemas-microsoft-com:vml" xmlns:wp14="http://schemas.microsoft.com/office/word/2010/wordprocessingDrawing" xmlns:wp="http://schemas.openxmlformats.org/drawingml/2006/wordprocessingDrawing" xmlns:w10="urn:schemas-microsoft-com:office:word" xmlns:w="http://schemas.openxmlformats.org/wordprocessingml/2006/main" xmlns:w14="http://schemas.microsoft.com/office/word/2010/wordml" xmlns:w15="http://schemas.microsoft.com/office/word/2012/wordml" xmlns:w16se="http://schemas.microsoft.com/office/word/2015/wordml/symex" xmlns:wpg="http://schemas.microsoft.com/office/word/2010/wordprocessingGroup" xmlns:wpi="http://schemas.microsoft.com/office/word/2010/wordprocessingInk" xmlns:wne="http://schemas.microsoft.com/office/word/2006/wordml" xmlns:wps="http://schemas.microsoft.com/office/word/2010/wordprocessingShape" mc:Ignorable="w14 w15 w16se wp14">
+<w:ftr xmlns:wpc="http://schemas.microsoft.com/office/word/2010/wordprocessingCanvas" xmlns:cx="http://schemas.microsoft.com/office/drawing/2014/chartex" xmlns:cx1="http://schemas.microsoft.com/office/drawing/2015/9/8/chartex" xmlns:cx2="http://schemas.microsoft.com/office/drawing/2015/10/21/chartex" xmlns:cx3="http://schemas.microsoft.com/office/drawing/2016/5/9/chartex" xmlns:cx4="http://schemas.microsoft.com/office/drawing/2016/5/10/chartex" xmlns:cx5="http://schemas.microsoft.com/office/drawing/2016/5/11/chartex" xmlns:cx6="http://schemas.microsoft.com/office/drawing/2016/5/12/chartex" xmlns:cx7="http://schemas.microsoft.com/office/drawing/2016/5/13/chartex" xmlns:cx8="http://schemas.microsoft.com/office/drawing/2016/5/14/chartex" xmlns:mc="http://schemas.openxmlformats.org/markup-compatibility/2006" xmlns:aink="http://schemas.microsoft.com/office/drawing/2016/ink" xmlns:am3d="http://schemas.microsoft.com/office/drawing/2017/model3d" xmlns:o="urn:schemas-microsoft-com:office:office" xmlns:oel="http://schemas.microsoft.com/office/2019/extlst" xmlns:r="http://schemas.openxmlformats.org/officeDocument/2006/relationships" xmlns:m="http://schemas.openxmlformats.org/officeDocument/2006/math" xmlns:v="urn:schemas-microsoft-com:vml" xmlns:wp14="http://schemas.microsoft.com/office/word/2010/wordprocessingDrawing" xmlns:wp="http://schemas.openxmlformats.org/drawingml/2006/wordprocessingDrawing" xmlns:w10="urn:schemas-microsoft-com:office:word" xmlns:w="http://schemas.openxmlformats.org/wordprocessingml/2006/main" xmlns:w14="http://schemas.microsoft.com/office/word/2010/wordml" xmlns:w15="http://schemas.microsoft.com/office/word/2012/wordml" xmlns:w16cex="http://schemas.microsoft.com/office/word/2018/wordml/cex" xmlns:w16cid="http://schemas.microsoft.com/office/word/2016/wordml/cid" xmlns:w16="http://schemas.microsoft.com/office/word/2018/wordml" xmlns:w16du="http://schemas.microsoft.com/office/word/2023/wordml/word16du" xmlns:w16sdtdh="http://schemas.microsoft.com/office/word/2020/wordml/sdtdatahash" xmlns:w16sdtfl="http://schemas.microsoft.com/office/word/2024/wordml/sdtformatlock" xmlns:w16se="http://schemas.microsoft.com/office/word/2015/wordml/symex" xmlns:wpg="http://schemas.microsoft.com/office/word/2010/wordprocessingGroup" xmlns:wpi="http://schemas.microsoft.com/office/word/2010/wordprocessingInk" xmlns:wne="http://schemas.microsoft.com/office/word/2006/wordml" xmlns:wps="http://schemas.microsoft.com/office/word/2010/wordprocessingShape" mc:Ignorable="w14 w15 w16se w16cid w16 w16cex w16sdtdh w16sdtfl w16du wp14">
   <w:p>
     <w:pPr>
       <w:pStyle w:val="Footer"/>
@@ -1300,7 +1682,7 @@
               <wp:docPr id="422312151" name="Text Box 3" descr="Internal">
                 <a:extLst xmlns:a="http://schemas.openxmlformats.org/drawingml/2006/main">
                   <a:ext uri="{5AE41FA2-C0FF-4470-9BD4-5FADCA87CBE2}">
-                    <aclsh:classification xmlns:aclsh="http://schemas.microsoft.com/office/drawing/2020/classificationShape" xmlns:w16sdtfl="http://schemas.microsoft.com/office/word/2024/wordml/sdtformatlock" xmlns:w16sdtdh="http://schemas.microsoft.com/office/word/2020/wordml/sdtdatahash" xmlns:w16du="http://schemas.microsoft.com/office/word/2023/wordml/word16du" xmlns:w16="http://schemas.microsoft.com/office/word/2018/wordml" xmlns:w16cid="http://schemas.microsoft.com/office/word/2016/wordml/cid" xmlns:w16cex="http://schemas.microsoft.com/office/word/2018/wordml/cex" xmlns:w="http://schemas.openxmlformats.org/wordprocessingml/2006/main" xmlns:w10="urn:schemas-microsoft-com:office:word" xmlns:v="urn:schemas-microsoft-com:vml" xmlns:oel="http://schemas.microsoft.com/office/2019/extlst" xmlns:o="urn:schemas-microsoft-com:office:office" xmlns:am3d="http://schemas.microsoft.com/office/drawing/2017/model3d" xmlns:aink="http://schemas.microsoft.com/office/drawing/2016/ink" xmlns:cx8="http://schemas.microsoft.com/office/drawing/2016/5/14/chartex" xmlns:cx7="http://schemas.microsoft.com/office/drawing/2016/5/13/chartex" xmlns:cx6="http://schemas.microsoft.com/office/drawing/2016/5/12/chartex" xmlns:cx5="http://schemas.microsoft.com/office/drawing/2016/5/11/chartex" xmlns:cx4="http://schemas.microsoft.com/office/drawing/2016/5/10/chartex" xmlns:cx3="http://schemas.microsoft.com/office/drawing/2016/5/9/chartex" xmlns:cx2="http://schemas.microsoft.com/office/drawing/2015/10/21/chartex" xmlns="" classificationOutcomeType="ftr"/>
+                    <aclsh:classification xmlns:aclsh="http://schemas.microsoft.com/office/drawing/2020/classificationShape" classificationOutcomeType="ftr"/>
                   </a:ext>
                 </a:extLst>
               </wp:docPr>
@@ -1360,14 +1742,13 @@
             </wp:anchor>
           </w:drawing>
         </mc:Choice>
-        <mc:Fallback xmlns:w16sdtfl="http://schemas.microsoft.com/office/word/2024/wordml/sdtformatlock" xmlns:w16sdtdh="http://schemas.microsoft.com/office/word/2020/wordml/sdtdatahash" xmlns:w16du="http://schemas.microsoft.com/office/word/2023/wordml/word16du" xmlns:w16="http://schemas.microsoft.com/office/word/2018/wordml" xmlns:w16cid="http://schemas.microsoft.com/office/word/2016/wordml/cid" xmlns:w16cex="http://schemas.microsoft.com/office/word/2018/wordml/cex" xmlns:oel="http://schemas.microsoft.com/office/2019/extlst" xmlns:am3d="http://schemas.microsoft.com/office/drawing/2017/model3d" xmlns:aink="http://schemas.microsoft.com/office/drawing/2016/ink" xmlns:cx8="http://schemas.microsoft.com/office/drawing/2016/5/14/chartex" xmlns:cx7="http://schemas.microsoft.com/office/drawing/2016/5/13/chartex" xmlns:cx6="http://schemas.microsoft.com/office/drawing/2016/5/12/chartex" xmlns:cx5="http://schemas.microsoft.com/office/drawing/2016/5/11/chartex" xmlns:cx4="http://schemas.microsoft.com/office/drawing/2016/5/10/chartex" xmlns:cx3="http://schemas.microsoft.com/office/drawing/2016/5/9/chartex" xmlns:cx2="http://schemas.microsoft.com/office/drawing/2015/10/21/chartex">
+        <mc:Fallback>
           <w:pict>
             <v:shapetype w14:anchorId="0CC2A22C" id="_x0000_t202" coordsize="21600,21600" o:spt="202" path="m,l,21600r21600,l21600,xe">
               <v:stroke joinstyle="miter"/>
               <v:path gradientshapeok="t" o:connecttype="rect"/>
             </v:shapetype>
             <v:shape id="Text Box 3" o:spid="_x0000_s1027" type="#_x0000_t202" alt="Internal" style="position:absolute;margin-left:0;margin-top:0;width:25.4pt;height:26.3pt;z-index:251660288;visibility:visible;mso-wrap-style:none;mso-wrap-distance-left:0;mso-wrap-distance-top:0;mso-wrap-distance-right:0;mso-wrap-distance-bottom:0;mso-position-horizontal:center;mso-position-horizontal-relative:page;mso-position-vertical:bottom;mso-position-vertical-relative:page;v-text-anchor:bottom" o:gfxdata="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" filled="f" stroked="f">
-              <v:fill o:detectmouseclick="t"/>
               <v:textbox style="mso-fit-shape-to-text:t" inset="0,0,0,15pt">
                 <w:txbxContent>
                   <w:p>
@@ -1405,7 +1786,7 @@
 </file>
 
 <file path=word/footer3.xml><?xml version="1.0" encoding="utf-8"?>
-<w:ftr xmlns:wpc="http://schemas.microsoft.com/office/word/2010/wordprocessingCanvas" xmlns:cx="http://schemas.microsoft.com/office/drawing/2014/chartex" xmlns:cx1="http://schemas.microsoft.com/office/drawing/2015/9/8/chartex" xmlns:mc="http://schemas.openxmlformats.org/markup-compatibility/2006" xmlns:o="urn:schemas-microsoft-com:office:office" xmlns:r="http://schemas.openxmlformats.org/officeDocument/2006/relationships" xmlns:m="http://schemas.openxmlformats.org/officeDocument/2006/math" xmlns:v="urn:schemas-microsoft-com:vml" xmlns:wp14="http://schemas.microsoft.com/office/word/2010/wordprocessingDrawing" xmlns:wp="http://schemas.openxmlformats.org/drawingml/2006/wordprocessingDrawing" xmlns:w10="urn:schemas-microsoft-com:office:word" xmlns:w="http://schemas.openxmlformats.org/wordprocessingml/2006/main" xmlns:w14="http://schemas.microsoft.com/office/word/2010/wordml" xmlns:w15="http://schemas.microsoft.com/office/word/2012/wordml" xmlns:w16se="http://schemas.microsoft.com/office/word/2015/wordml/symex" xmlns:wpg="http://schemas.microsoft.com/office/word/2010/wordprocessingGroup" xmlns:wpi="http://schemas.microsoft.com/office/word/2010/wordprocessingInk" xmlns:wne="http://schemas.microsoft.com/office/word/2006/wordml" xmlns:wps="http://schemas.microsoft.com/office/word/2010/wordprocessingShape" mc:Ignorable="w14 w15 w16se wp14">
+<w:ftr xmlns:wpc="http://schemas.microsoft.com/office/word/2010/wordprocessingCanvas" xmlns:cx="http://schemas.microsoft.com/office/drawing/2014/chartex" xmlns:cx1="http://schemas.microsoft.com/office/drawing/2015/9/8/chartex" xmlns:cx2="http://schemas.microsoft.com/office/drawing/2015/10/21/chartex" xmlns:cx3="http://schemas.microsoft.com/office/drawing/2016/5/9/chartex" xmlns:cx4="http://schemas.microsoft.com/office/drawing/2016/5/10/chartex" xmlns:cx5="http://schemas.microsoft.com/office/drawing/2016/5/11/chartex" xmlns:cx6="http://schemas.microsoft.com/office/drawing/2016/5/12/chartex" xmlns:cx7="http://schemas.microsoft.com/office/drawing/2016/5/13/chartex" xmlns:cx8="http://schemas.microsoft.com/office/drawing/2016/5/14/chartex" xmlns:mc="http://schemas.openxmlformats.org/markup-compatibility/2006" xmlns:aink="http://schemas.microsoft.com/office/drawing/2016/ink" xmlns:am3d="http://schemas.microsoft.com/office/drawing/2017/model3d" xmlns:o="urn:schemas-microsoft-com:office:office" xmlns:oel="http://schemas.microsoft.com/office/2019/extlst" xmlns:r="http://schemas.openxmlformats.org/officeDocument/2006/relationships" xmlns:m="http://schemas.openxmlformats.org/officeDocument/2006/math" xmlns:v="urn:schemas-microsoft-com:vml" xmlns:wp14="http://schemas.microsoft.com/office/word/2010/wordprocessingDrawing" xmlns:wp="http://schemas.openxmlformats.org/drawingml/2006/wordprocessingDrawing" xmlns:w10="urn:schemas-microsoft-com:office:word" xmlns:w="http://schemas.openxmlformats.org/wordprocessingml/2006/main" xmlns:w14="http://schemas.microsoft.com/office/word/2010/wordml" xmlns:w15="http://schemas.microsoft.com/office/word/2012/wordml" xmlns:w16cex="http://schemas.microsoft.com/office/word/2018/wordml/cex" xmlns:w16cid="http://schemas.microsoft.com/office/word/2016/wordml/cid" xmlns:w16="http://schemas.microsoft.com/office/word/2018/wordml" xmlns:w16du="http://schemas.microsoft.com/office/word/2023/wordml/word16du" xmlns:w16sdtdh="http://schemas.microsoft.com/office/word/2020/wordml/sdtdatahash" xmlns:w16sdtfl="http://schemas.microsoft.com/office/word/2024/wordml/sdtformatlock" xmlns:w16se="http://schemas.microsoft.com/office/word/2015/wordml/symex" xmlns:wpg="http://schemas.microsoft.com/office/word/2010/wordprocessingGroup" xmlns:wpi="http://schemas.microsoft.com/office/word/2010/wordprocessingInk" xmlns:wne="http://schemas.microsoft.com/office/word/2006/wordml" xmlns:wps="http://schemas.microsoft.com/office/word/2010/wordprocessingShape" mc:Ignorable="w14 w15 w16se w16cid w16 w16cex w16sdtdh w16sdtfl w16du wp14">
   <w:p>
     <w:pPr>
       <w:pStyle w:val="Footer"/>
@@ -1431,7 +1812,7 @@
               <wp:docPr id="1430184674" name="Text Box 1" descr="Internal">
                 <a:extLst xmlns:a="http://schemas.openxmlformats.org/drawingml/2006/main">
                   <a:ext uri="{5AE41FA2-C0FF-4470-9BD4-5FADCA87CBE2}">
-                    <aclsh:classification xmlns:aclsh="http://schemas.microsoft.com/office/drawing/2020/classificationShape" xmlns:w16sdtfl="http://schemas.microsoft.com/office/word/2024/wordml/sdtformatlock" xmlns:w16sdtdh="http://schemas.microsoft.com/office/word/2020/wordml/sdtdatahash" xmlns:w16du="http://schemas.microsoft.com/office/word/2023/wordml/word16du" xmlns:w16="http://schemas.microsoft.com/office/word/2018/wordml" xmlns:w16cid="http://schemas.microsoft.com/office/word/2016/wordml/cid" xmlns:w16cex="http://schemas.microsoft.com/office/word/2018/wordml/cex" xmlns:w="http://schemas.openxmlformats.org/wordprocessingml/2006/main" xmlns:w10="urn:schemas-microsoft-com:office:word" xmlns:v="urn:schemas-microsoft-com:vml" xmlns:oel="http://schemas.microsoft.com/office/2019/extlst" xmlns:o="urn:schemas-microsoft-com:office:office" xmlns:am3d="http://schemas.microsoft.com/office/drawing/2017/model3d" xmlns:aink="http://schemas.microsoft.com/office/drawing/2016/ink" xmlns:cx8="http://schemas.microsoft.com/office/drawing/2016/5/14/chartex" xmlns:cx7="http://schemas.microsoft.com/office/drawing/2016/5/13/chartex" xmlns:cx6="http://schemas.microsoft.com/office/drawing/2016/5/12/chartex" xmlns:cx5="http://schemas.microsoft.com/office/drawing/2016/5/11/chartex" xmlns:cx4="http://schemas.microsoft.com/office/drawing/2016/5/10/chartex" xmlns:cx3="http://schemas.microsoft.com/office/drawing/2016/5/9/chartex" xmlns:cx2="http://schemas.microsoft.com/office/drawing/2015/10/21/chartex" xmlns="" classificationOutcomeType="ftr"/>
+                    <aclsh:classification xmlns:aclsh="http://schemas.microsoft.com/office/drawing/2020/classificationShape" classificationOutcomeType="ftr"/>
                   </a:ext>
                 </a:extLst>
               </wp:docPr>
@@ -1491,14 +1872,13 @@
             </wp:anchor>
           </w:drawing>
         </mc:Choice>
-        <mc:Fallback xmlns:w16sdtfl="http://schemas.microsoft.com/office/word/2024/wordml/sdtformatlock" xmlns:w16sdtdh="http://schemas.microsoft.com/office/word/2020/wordml/sdtdatahash" xmlns:w16du="http://schemas.microsoft.com/office/word/2023/wordml/word16du" xmlns:w16="http://schemas.microsoft.com/office/word/2018/wordml" xmlns:w16cid="http://schemas.microsoft.com/office/word/2016/wordml/cid" xmlns:w16cex="http://schemas.microsoft.com/office/word/2018/wordml/cex" xmlns:oel="http://schemas.microsoft.com/office/2019/extlst" xmlns:am3d="http://schemas.microsoft.com/office/drawing/2017/model3d" xmlns:aink="http://schemas.microsoft.com/office/drawing/2016/ink" xmlns:cx8="http://schemas.microsoft.com/office/drawing/2016/5/14/chartex" xmlns:cx7="http://schemas.microsoft.com/office/drawing/2016/5/13/chartex" xmlns:cx6="http://schemas.microsoft.com/office/drawing/2016/5/12/chartex" xmlns:cx5="http://schemas.microsoft.com/office/drawing/2016/5/11/chartex" xmlns:cx4="http://schemas.microsoft.com/office/drawing/2016/5/10/chartex" xmlns:cx3="http://schemas.microsoft.com/office/drawing/2016/5/9/chartex" xmlns:cx2="http://schemas.microsoft.com/office/drawing/2015/10/21/chartex">
+        <mc:Fallback>
           <w:pict>
             <v:shapetype w14:anchorId="7D55A092" id="_x0000_t202" coordsize="21600,21600" o:spt="202" path="m,l,21600r21600,l21600,xe">
               <v:stroke joinstyle="miter"/>
               <v:path gradientshapeok="t" o:connecttype="rect"/>
             </v:shapetype>
             <v:shape id="Text Box 1" o:spid="_x0000_s1028" type="#_x0000_t202" alt="Internal" style="position:absolute;margin-left:0;margin-top:0;width:25.4pt;height:26.3pt;z-index:251658240;visibility:visible;mso-wrap-style:none;mso-wrap-distance-left:0;mso-wrap-distance-top:0;mso-wrap-distance-right:0;mso-wrap-distance-bottom:0;mso-position-horizontal:center;mso-position-horizontal-relative:page;mso-position-vertical:bottom;mso-position-vertical-relative:page;v-text-anchor:bottom" o:gfxdata="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" filled="f" stroked="f">
-              <v:fill o:detectmouseclick="t"/>
               <v:textbox style="mso-fit-shape-to-text:t" inset="0,0,0,15pt">
                 <w:txbxContent>
                   <w:p>
@@ -1536,7 +1916,7 @@
 </file>
 
 <file path=word/footnotes.xml><?xml version="1.0" encoding="utf-8"?>
-<w:footnotes xmlns:wpc="http://schemas.microsoft.com/office/word/2010/wordprocessingCanvas" xmlns:cx="http://schemas.microsoft.com/office/drawing/2014/chartex" xmlns:cx1="http://schemas.microsoft.com/office/drawing/2015/9/8/chartex" xmlns:mc="http://schemas.openxmlformats.org/markup-compatibility/2006" xmlns:o="urn:schemas-microsoft-com:office:office" xmlns:r="http://schemas.openxmlformats.org/officeDocument/2006/relationships" xmlns:m="http://schemas.openxmlformats.org/officeDocument/2006/math" xmlns:v="urn:schemas-microsoft-com:vml" xmlns:wp14="http://schemas.microsoft.com/office/word/2010/wordprocessingDrawing" xmlns:wp="http://schemas.openxmlformats.org/drawingml/2006/wordprocessingDrawing" xmlns:w10="urn:schemas-microsoft-com:office:word" xmlns:w="http://schemas.openxmlformats.org/wordprocessingml/2006/main" xmlns:w14="http://schemas.microsoft.com/office/word/2010/wordml" xmlns:w15="http://schemas.microsoft.com/office/word/2012/wordml" xmlns:w16se="http://schemas.microsoft.com/office/word/2015/wordml/symex" xmlns:wpg="http://schemas.microsoft.com/office/word/2010/wordprocessingGroup" xmlns:wpi="http://schemas.microsoft.com/office/word/2010/wordprocessingInk" xmlns:wne="http://schemas.microsoft.com/office/word/2006/wordml" xmlns:wps="http://schemas.microsoft.com/office/word/2010/wordprocessingShape" mc:Ignorable="w14 w15 w16se wp14">
+<w:footnotes xmlns:wpc="http://schemas.microsoft.com/office/word/2010/wordprocessingCanvas" xmlns:cx="http://schemas.microsoft.com/office/drawing/2014/chartex" xmlns:cx1="http://schemas.microsoft.com/office/drawing/2015/9/8/chartex" xmlns:cx2="http://schemas.microsoft.com/office/drawing/2015/10/21/chartex" xmlns:cx3="http://schemas.microsoft.com/office/drawing/2016/5/9/chartex" xmlns:cx4="http://schemas.microsoft.com/office/drawing/2016/5/10/chartex" xmlns:cx5="http://schemas.microsoft.com/office/drawing/2016/5/11/chartex" xmlns:cx6="http://schemas.microsoft.com/office/drawing/2016/5/12/chartex" xmlns:cx7="http://schemas.microsoft.com/office/drawing/2016/5/13/chartex" xmlns:cx8="http://schemas.microsoft.com/office/drawing/2016/5/14/chartex" xmlns:mc="http://schemas.openxmlformats.org/markup-compatibility/2006" xmlns:aink="http://schemas.microsoft.com/office/drawing/2016/ink" xmlns:am3d="http://schemas.microsoft.com/office/drawing/2017/model3d" xmlns:o="urn:schemas-microsoft-com:office:office" xmlns:oel="http://schemas.microsoft.com/office/2019/extlst" xmlns:r="http://schemas.openxmlformats.org/officeDocument/2006/relationships" xmlns:m="http://schemas.openxmlformats.org/officeDocument/2006/math" xmlns:v="urn:schemas-microsoft-com:vml" xmlns:wp14="http://schemas.microsoft.com/office/word/2010/wordprocessingDrawing" xmlns:wp="http://schemas.openxmlformats.org/drawingml/2006/wordprocessingDrawing" xmlns:w10="urn:schemas-microsoft-com:office:word" xmlns:w="http://schemas.openxmlformats.org/wordprocessingml/2006/main" xmlns:w14="http://schemas.microsoft.com/office/word/2010/wordml" xmlns:w15="http://schemas.microsoft.com/office/word/2012/wordml" xmlns:w16cex="http://schemas.microsoft.com/office/word/2018/wordml/cex" xmlns:w16cid="http://schemas.microsoft.com/office/word/2016/wordml/cid" xmlns:w16="http://schemas.microsoft.com/office/word/2018/wordml" xmlns:w16du="http://schemas.microsoft.com/office/word/2023/wordml/word16du" xmlns:w16sdtdh="http://schemas.microsoft.com/office/word/2020/wordml/sdtdatahash" xmlns:w16sdtfl="http://schemas.microsoft.com/office/word/2024/wordml/sdtformatlock" xmlns:w16se="http://schemas.microsoft.com/office/word/2015/wordml/symex" xmlns:wpg="http://schemas.microsoft.com/office/word/2010/wordprocessingGroup" xmlns:wpi="http://schemas.microsoft.com/office/word/2010/wordprocessingInk" xmlns:wne="http://schemas.microsoft.com/office/word/2006/wordml" xmlns:wps="http://schemas.microsoft.com/office/word/2010/wordprocessingShape" mc:Ignorable="w14 w15 w16se w16cid w16 w16cex w16sdtdh w16sdtfl w16du wp14">
   <w:footnote w:type="separator" w:id="-1">
     <w:p>
       <w:pPr>
@@ -1561,7 +1941,7 @@
 </file>
 
 <file path=word/numbering.xml><?xml version="1.0" encoding="utf-8"?>
-<w:numbering xmlns:wpc="http://schemas.microsoft.com/office/word/2010/wordprocessingCanvas" xmlns:cx="http://schemas.microsoft.com/office/drawing/2014/chartex" xmlns:cx1="http://schemas.microsoft.com/office/drawing/2015/9/8/chartex" xmlns:mc="http://schemas.openxmlformats.org/markup-compatibility/2006" xmlns:o="urn:schemas-microsoft-com:office:office" xmlns:r="http://schemas.openxmlformats.org/officeDocument/2006/relationships" xmlns:m="http://schemas.openxmlformats.org/officeDocument/2006/math" xmlns:v="urn:schemas-microsoft-com:vml" xmlns:wp14="http://schemas.microsoft.com/office/word/2010/wordprocessingDrawing" xmlns:wp="http://schemas.openxmlformats.org/drawingml/2006/wordprocessingDrawing" xmlns:w10="urn:schemas-microsoft-com:office:word" xmlns:w="http://schemas.openxmlformats.org/wordprocessingml/2006/main" xmlns:w14="http://schemas.microsoft.com/office/word/2010/wordml" xmlns:w15="http://schemas.microsoft.com/office/word/2012/wordml" xmlns:w16se="http://schemas.microsoft.com/office/word/2015/wordml/symex" xmlns:wpg="http://schemas.microsoft.com/office/word/2010/wordprocessingGroup" xmlns:wpi="http://schemas.microsoft.com/office/word/2010/wordprocessingInk" xmlns:wne="http://schemas.microsoft.com/office/word/2006/wordml" xmlns:wps="http://schemas.microsoft.com/office/word/2010/wordprocessingShape" mc:Ignorable="w14 w15 w16se wp14">
+<w:numbering xmlns:wpc="http://schemas.microsoft.com/office/word/2010/wordprocessingCanvas" xmlns:cx="http://schemas.microsoft.com/office/drawing/2014/chartex" xmlns:cx1="http://schemas.microsoft.com/office/drawing/2015/9/8/chartex" xmlns:cx2="http://schemas.microsoft.com/office/drawing/2015/10/21/chartex" xmlns:cx3="http://schemas.microsoft.com/office/drawing/2016/5/9/chartex" xmlns:cx4="http://schemas.microsoft.com/office/drawing/2016/5/10/chartex" xmlns:cx5="http://schemas.microsoft.com/office/drawing/2016/5/11/chartex" xmlns:cx6="http://schemas.microsoft.com/office/drawing/2016/5/12/chartex" xmlns:cx7="http://schemas.microsoft.com/office/drawing/2016/5/13/chartex" xmlns:cx8="http://schemas.microsoft.com/office/drawing/2016/5/14/chartex" xmlns:mc="http://schemas.openxmlformats.org/markup-compatibility/2006" xmlns:aink="http://schemas.microsoft.com/office/drawing/2016/ink" xmlns:am3d="http://schemas.microsoft.com/office/drawing/2017/model3d" xmlns:o="urn:schemas-microsoft-com:office:office" xmlns:oel="http://schemas.microsoft.com/office/2019/extlst" xmlns:r="http://schemas.openxmlformats.org/officeDocument/2006/relationships" xmlns:m="http://schemas.openxmlformats.org/officeDocument/2006/math" xmlns:v="urn:schemas-microsoft-com:vml" xmlns:wp14="http://schemas.microsoft.com/office/word/2010/wordprocessingDrawing" xmlns:wp="http://schemas.openxmlformats.org/drawingml/2006/wordprocessingDrawing" xmlns:w10="urn:schemas-microsoft-com:office:word" xmlns:w="http://schemas.openxmlformats.org/wordprocessingml/2006/main" xmlns:w14="http://schemas.microsoft.com/office/word/2010/wordml" xmlns:w15="http://schemas.microsoft.com/office/word/2012/wordml" xmlns:w16cex="http://schemas.microsoft.com/office/word/2018/wordml/cex" xmlns:w16cid="http://schemas.microsoft.com/office/word/2016/wordml/cid" xmlns:w16="http://schemas.microsoft.com/office/word/2018/wordml" xmlns:w16du="http://schemas.microsoft.com/office/word/2023/wordml/word16du" xmlns:w16sdtdh="http://schemas.microsoft.com/office/word/2020/wordml/sdtdatahash" xmlns:w16sdtfl="http://schemas.microsoft.com/office/word/2024/wordml/sdtformatlock" xmlns:w16se="http://schemas.microsoft.com/office/word/2015/wordml/symex" xmlns:wpg="http://schemas.microsoft.com/office/word/2010/wordprocessingGroup" xmlns:wpi="http://schemas.microsoft.com/office/word/2010/wordprocessingInk" xmlns:wne="http://schemas.microsoft.com/office/word/2006/wordml" xmlns:wps="http://schemas.microsoft.com/office/word/2010/wordprocessingShape" mc:Ignorable="w14 w15 w16se w16cid w16 w16cex w16sdtdh w16sdtfl w16du wp14">
   <w:abstractNum w:abstractNumId="0" w15:restartNumberingAfterBreak="0">
     <w:nsid w:val="2BC56931"/>
     <w:multiLevelType w:val="hybridMultilevel"/>
@@ -1740,17 +2120,17 @@
       </w:pPr>
     </w:lvl>
   </w:abstractNum>
-  <w:num w:numId="1">
+  <w:num w:numId="1" w16cid:durableId="476187458">
     <w:abstractNumId w:val="1"/>
   </w:num>
-  <w:num w:numId="2">
+  <w:num w:numId="2" w16cid:durableId="1669938674">
     <w:abstractNumId w:val="0"/>
   </w:num>
 </w:numbering>
 </file>
 
 <file path=word/styles.xml><?xml version="1.0" encoding="utf-8"?>
-<w:styles xmlns:mc="http://schemas.openxmlformats.org/markup-compatibility/2006" xmlns:r="http://schemas.openxmlformats.org/officeDocument/2006/relationships" xmlns:w="http://schemas.openxmlformats.org/wordprocessingml/2006/main" xmlns:w14="http://schemas.microsoft.com/office/word/2010/wordml" xmlns:w15="http://schemas.microsoft.com/office/word/2012/wordml" xmlns:w16se="http://schemas.microsoft.com/office/word/2015/wordml/symex" mc:Ignorable="w14 w15 w16se">
+<w:styles xmlns:mc="http://schemas.openxmlformats.org/markup-compatibility/2006" xmlns:r="http://schemas.openxmlformats.org/officeDocument/2006/relationships" xmlns:w="http://schemas.openxmlformats.org/wordprocessingml/2006/main" xmlns:w14="http://schemas.microsoft.com/office/word/2010/wordml" xmlns:w15="http://schemas.microsoft.com/office/word/2012/wordml" xmlns:w16cex="http://schemas.microsoft.com/office/word/2018/wordml/cex" xmlns:w16cid="http://schemas.microsoft.com/office/word/2016/wordml/cid" xmlns:w16="http://schemas.microsoft.com/office/word/2018/wordml" xmlns:w16du="http://schemas.microsoft.com/office/word/2023/wordml/word16du" xmlns:w16sdtdh="http://schemas.microsoft.com/office/word/2020/wordml/sdtdatahash" xmlns:w16sdtfl="http://schemas.microsoft.com/office/word/2024/wordml/sdtformatlock" xmlns:w16se="http://schemas.microsoft.com/office/word/2015/wordml/symex" mc:Ignorable="w14 w15 w16se w16cid w16 w16cex w16sdtdh w16sdtfl w16du">
   <w:docDefaults>
     <w:rPrDefault>
       <w:rPr>
@@ -1768,7 +2148,7 @@
       </w:pPr>
     </w:pPrDefault>
   </w:docDefaults>
-  <w:latentStyles w:defLockedState="0" w:defUIPriority="99" w:defSemiHidden="0" w:defUnhideWhenUsed="0" w:defQFormat="0" w:count="371">
+  <w:latentStyles w:defLockedState="0" w:defUIPriority="99" w:defSemiHidden="0" w:defUnhideWhenUsed="0" w:defQFormat="0" w:count="376">
     <w:lsdException w:name="Normal" w:uiPriority="0" w:qFormat="1"/>
     <w:lsdException w:name="heading 1" w:uiPriority="9" w:qFormat="1"/>
     <w:lsdException w:name="heading 2" w:semiHidden="1" w:uiPriority="9" w:unhideWhenUsed="1" w:qFormat="1"/>
@@ -2140,6 +2520,11 @@
     <w:lsdException w:name="List Table 5 Dark Accent 6" w:uiPriority="50"/>
     <w:lsdException w:name="List Table 6 Colorful Accent 6" w:uiPriority="51"/>
     <w:lsdException w:name="List Table 7 Colorful Accent 6" w:uiPriority="52"/>
+    <w:lsdException w:name="Mention" w:semiHidden="1" w:unhideWhenUsed="1"/>
+    <w:lsdException w:name="Smart Hyperlink" w:semiHidden="1" w:unhideWhenUsed="1"/>
+    <w:lsdException w:name="Hashtag" w:semiHidden="1" w:unhideWhenUsed="1"/>
+    <w:lsdException w:name="Unresolved Mention" w:semiHidden="1" w:unhideWhenUsed="1"/>
+    <w:lsdException w:name="Smart Link" w:semiHidden="1" w:unhideWhenUsed="1"/>
   </w:latentStyles>
   <w:style w:type="paragraph" w:default="1" w:styleId="Normal">
     <w:name w:val="Normal"/>
@@ -2347,7 +2732,6 @@
   <w:style w:type="character" w:default="1" w:styleId="DefaultParagraphFont">
     <w:name w:val="Default Paragraph Font"/>
     <w:uiPriority w:val="1"/>
-    <w:semiHidden/>
     <w:unhideWhenUsed/>
   </w:style>
   <w:style w:type="table" w:default="1" w:styleId="TableNormal">
@@ -2711,6 +3095,18 @@
     <w:link w:val="Footer"/>
     <w:uiPriority w:val="99"/>
     <w:rsid w:val="00264F6C"/>
+  </w:style>
+  <w:style w:type="character" w:styleId="UnresolvedMention">
+    <w:name w:val="Unresolved Mention"/>
+    <w:basedOn w:val="DefaultParagraphFont"/>
+    <w:uiPriority w:val="99"/>
+    <w:semiHidden/>
+    <w:unhideWhenUsed/>
+    <w:rsid w:val="004D64BF"/>
+    <w:rPr>
+      <w:color w:val="605E5C"/>
+      <w:shd w:val="clear" w:color="auto" w:fill="E1DFDD"/>
+    </w:rPr>
   </w:style>
 </w:styles>
 </file>

</xml_diff>